<commit_message>
docs: revisao v1.1 - remove veiculos/motoristas e adota agenda por horario
Ajustes solicitados pela Secretaria de Saude:
- Remove os cadastros de Veiculos e Motoristas (modulos e entidades)
- Agenda organizada por horario (06:00-16:30, seg-sex), em ordem de
  agendamento; substitui o antigo Mapa de Viagem pela Lista do Dia
- Relatorios com consultas por agendamento, dia, mes, nome e outros
- Atualiza MER, perfis (remove Motorista), fases e decisoes pendentes
- Atualiza a apresentacao institucional para refletir os mesmos ajustes

Co-Authored-By: Claude Opus 4.8 <noreply@anthropic.com>
Claude-Session: https://claude.ai/code/session_01RwkWeeZuQzAXsxBUaQxZem
</commit_message>
<xml_diff>
--- a/docs/SIGTRANS_Saude_Escopo_Arquitetura.docx
+++ b/docs/SIGTRANS_Saude_Escopo_Arquitetura.docx
@@ -118,7 +118,7 @@
           <w:sz w:val="18"/>
           <w:szCs w:val="18"/>
         </w:rPr>
-        <w:t xml:space="preserve">Versão 1.0  ·  Agosto de 2026</w:t>
+        <w:t xml:space="preserve">Versão 1.1  ·  Agosto de 2026</w:t>
       </w:r>
     </w:p>
     <w:p>
@@ -185,6 +185,95 @@
           <w:szCs w:val="21"/>
         </w:rPr>
         <w:t xml:space="preserve">desenvolvimento e manutenção pela própria TI da Prefeitura; hospedagem em servidor local (Windows Server), sem uso de nuvem pública para dados de pacientes; autenticação com contas próprias do sistema; e o BPA atendido por relatório em PDF para digitação manual, sem geração de arquivo magnético.</w:t>
+      </w:r>
+    </w:p>
+    <w:p>
+      <w:pPr>
+        <w:spacing w:after="40" w:line="276"/>
+      </w:pPr>
+      <w:r>
+        <w:rPr>
+          <w:b/>
+          <w:bCs/>
+          <w:color w:val="2E74B5"/>
+          <w:sz w:val="21"/>
+          <w:szCs w:val="21"/>
+        </w:rPr>
+        <w:t xml:space="preserve">Ajustes desta revisão (v1.1), solicitados pela Secretaria de Saúde: </w:t>
+      </w:r>
+    </w:p>
+    <w:p>
+      <w:pPr>
+        <w:pStyle w:val="ListParagraph"/>
+        <w:numPr>
+          <w:ilvl w:val="0"/>
+          <w:numId w:val="2"/>
+        </w:numPr>
+        <w:spacing w:after="60" w:line="264"/>
+      </w:pPr>
+      <w:r>
+        <w:rPr>
+          <w:sz w:val="21"/>
+          <w:szCs w:val="21"/>
+        </w:rPr>
+        <w:t xml:space="preserve">Removidos os cadastros de Veículos e de Motoristas;</w:t>
+      </w:r>
+    </w:p>
+    <w:p>
+      <w:pPr>
+        <w:pStyle w:val="ListParagraph"/>
+        <w:numPr>
+          <w:ilvl w:val="0"/>
+          <w:numId w:val="2"/>
+        </w:numPr>
+        <w:spacing w:after="60" w:line="264"/>
+      </w:pPr>
+      <w:r>
+        <w:rPr>
+          <w:sz w:val="21"/>
+          <w:szCs w:val="21"/>
+        </w:rPr>
+        <w:t xml:space="preserve">A agenda passa a organizar os atendimentos por horário, em ordem de agendamento, das 06:00 às 16:30, de segunda a sexta-feira;</w:t>
+      </w:r>
+    </w:p>
+    <w:p>
+      <w:pPr>
+        <w:pStyle w:val="ListParagraph"/>
+        <w:numPr>
+          <w:ilvl w:val="0"/>
+          <w:numId w:val="2"/>
+        </w:numPr>
+        <w:spacing w:after="60" w:line="264"/>
+      </w:pPr>
+      <w:r>
+        <w:rPr>
+          <w:sz w:val="21"/>
+          <w:szCs w:val="21"/>
+        </w:rPr>
+        <w:t xml:space="preserve">Os relatórios ganham consultas por agendamento, dia, mês, nome do paciente e demais filtros.</w:t>
+      </w:r>
+    </w:p>
+    <w:p>
+      <w:pPr>
+        <w:spacing w:after="120" w:line="276"/>
+      </w:pPr>
+      <w:r>
+        <w:rPr>
+          <w:b/>
+          <w:bCs/>
+          <w:i/>
+          <w:iCs/>
+          <w:sz w:val="21"/>
+          <w:szCs w:val="21"/>
+        </w:rPr>
+        <w:t xml:space="preserve">Premissas adotadas nesta revisão (a confirmar com a Secretaria): </w:t>
+      </w:r>
+      <w:r>
+        <w:rPr>
+          <w:sz w:val="21"/>
+          <w:szCs w:val="21"/>
+        </w:rPr>
+        <w:t xml:space="preserve">o campo “tipo de veículo” é mantido apenas como opção de seleção no agendamento (consta na ficha atual); a quantidade de pacientes por horário é um parâmetro configurável; e a granularidade dos intervalos (ex.: de 30 em 30 minutos ou horário livre) será definida pela Secretaria.</w:t>
       </w:r>
     </w:p>
     <w:p>
@@ -906,7 +995,7 @@
           <w:sz w:val="21"/>
           <w:szCs w:val="21"/>
         </w:rPr>
-        <w:t xml:space="preserve">Informatizar o ciclo completo do transporte de pacientes, substituindo os formulários em papel por um sistema web único, com cadastro sem duplicidade, controle automático de lotação dos veículos, emissão de documentos em PDF, painel eletrônico de senhas e relatórios que agilizem a digitação do BPA — tudo com registro de auditoria e em conformidade com a LGPD.</w:t>
+        <w:t xml:space="preserve">Informatizar o ciclo completo do transporte de pacientes, substituindo os formulários em papel por um sistema web único, com cadastro sem duplicidade, agenda organizada por horário, emissão de documentos em PDF, painel eletrônico de senhas e relatórios que agilizem a digitação do BPA — tudo com registro de auditoria e em conformidade com a LGPD.</w:t>
       </w:r>
     </w:p>
     <w:p>
@@ -927,7 +1016,7 @@
           <w:sz w:val="21"/>
           <w:szCs w:val="21"/>
         </w:rPr>
-        <w:t xml:space="preserve">Senha → Cadastro/identificação do paciente → Agendamento (viagem, veículo, procedimento) → Cartão de Embarque (PDF) → Mapa de Viagem → Embarque/Desembarque → Relatório para o BPA.</w:t>
+        <w:t xml:space="preserve">Senha → Cadastro/identificação do paciente → Agendamento (horário e procedimento) → Cartão de Embarque (PDF) → Lista do Dia → Embarque/Desembarque → Relatório para o BPA.</w:t>
       </w:r>
     </w:p>
     <w:p>
@@ -1181,7 +1270,7 @@
                 <w:sz w:val="19"/>
                 <w:szCs w:val="19"/>
               </w:rPr>
-              <w:t xml:space="preserve">Cadastro de Veículos</w:t>
+              <w:t xml:space="preserve">Cadastro de Destinos</w:t>
             </w:r>
           </w:p>
         </w:tc>
@@ -1208,7 +1297,7 @@
                 <w:sz w:val="19"/>
                 <w:szCs w:val="19"/>
               </w:rPr>
-              <w:t xml:space="preserve">Tipo, placa, lotação e situação; base do controle de vagas.</w:t>
+              <w:t xml:space="preserve">Municípios e estabelecimentos de destino.</w:t>
             </w:r>
           </w:p>
         </w:tc>
@@ -1263,7 +1352,7 @@
                 <w:sz w:val="19"/>
                 <w:szCs w:val="19"/>
               </w:rPr>
-              <w:t xml:space="preserve">Cadastro de Motoristas</w:t>
+              <w:t xml:space="preserve">Agenda e Agendamento</w:t>
             </w:r>
           </w:p>
         </w:tc>
@@ -1289,7 +1378,7 @@
                 <w:sz w:val="19"/>
                 <w:szCs w:val="19"/>
               </w:rPr>
-              <w:t xml:space="preserve">Dados e CNH; vínculo com as viagens.</w:t>
+              <w:t xml:space="preserve">Agendamento por horário (06:00–16:30, seg–sex), em ordem de marcação.</w:t>
             </w:r>
           </w:p>
         </w:tc>
@@ -1315,7 +1404,7 @@
                 <w:sz w:val="19"/>
                 <w:szCs w:val="19"/>
               </w:rPr>
-              <w:t xml:space="preserve">1</w:t>
+              <w:t xml:space="preserve">2</w:t>
             </w:r>
           </w:p>
         </w:tc>
@@ -1344,7 +1433,7 @@
                 <w:sz w:val="19"/>
                 <w:szCs w:val="19"/>
               </w:rPr>
-              <w:t xml:space="preserve">Cadastro de Destinos</w:t>
+              <w:t xml:space="preserve">Cartão de Embarque (PDF)</w:t>
             </w:r>
           </w:p>
         </w:tc>
@@ -1371,7 +1460,7 @@
                 <w:sz w:val="19"/>
                 <w:szCs w:val="19"/>
               </w:rPr>
-              <w:t xml:space="preserve">Municípios e estabelecimentos de destino.</w:t>
+              <w:t xml:space="preserve">Emissão do documento no layout da Prefeitura.</w:t>
             </w:r>
           </w:p>
         </w:tc>
@@ -1398,7 +1487,7 @@
                 <w:sz w:val="19"/>
                 <w:szCs w:val="19"/>
               </w:rPr>
-              <w:t xml:space="preserve">1</w:t>
+              <w:t xml:space="preserve">2</w:t>
             </w:r>
           </w:p>
         </w:tc>
@@ -1426,7 +1515,7 @@
                 <w:sz w:val="19"/>
                 <w:szCs w:val="19"/>
               </w:rPr>
-              <w:t xml:space="preserve">Viagem e Agendamento</w:t>
+              <w:t xml:space="preserve">Lista do Dia</w:t>
             </w:r>
           </w:p>
         </w:tc>
@@ -1452,7 +1541,7 @@
                 <w:sz w:val="19"/>
                 <w:szCs w:val="19"/>
               </w:rPr>
-              <w:t xml:space="preserve">Agendamento por paciente vinculado a uma viagem, com controle de lotação.</w:t>
+              <w:t xml:space="preserve">Relação de pacientes por data e horário, em ordem.</w:t>
             </w:r>
           </w:p>
         </w:tc>
@@ -1507,7 +1596,7 @@
                 <w:sz w:val="19"/>
                 <w:szCs w:val="19"/>
               </w:rPr>
-              <w:t xml:space="preserve">Cartão de Embarque (PDF)</w:t>
+              <w:t xml:space="preserve">Controle de Embarque</w:t>
             </w:r>
           </w:p>
         </w:tc>
@@ -1534,7 +1623,7 @@
                 <w:sz w:val="19"/>
                 <w:szCs w:val="19"/>
               </w:rPr>
-              <w:t xml:space="preserve">Emissão do documento no layout da Prefeitura.</w:t>
+              <w:t xml:space="preserve">Registro de embarcou/faltou e horários.</w:t>
             </w:r>
           </w:p>
         </w:tc>
@@ -1589,7 +1678,7 @@
                 <w:sz w:val="19"/>
                 <w:szCs w:val="19"/>
               </w:rPr>
-              <w:t xml:space="preserve">Mapa de Viagem</w:t>
+              <w:t xml:space="preserve">Painel de Senhas</w:t>
             </w:r>
           </w:p>
         </w:tc>
@@ -1615,7 +1704,7 @@
                 <w:sz w:val="19"/>
                 <w:szCs w:val="19"/>
               </w:rPr>
-              <w:t xml:space="preserve">Lista de passageiros por veículo/destino/data (folha da van).</w:t>
+              <w:t xml:space="preserve">Emissão MT-01 a MT-50, chamadas e painel de TV.</w:t>
             </w:r>
           </w:p>
         </w:tc>
@@ -1641,7 +1730,7 @@
                 <w:sz w:val="19"/>
                 <w:szCs w:val="19"/>
               </w:rPr>
-              <w:t xml:space="preserve">2</w:t>
+              <w:t xml:space="preserve">3</w:t>
             </w:r>
           </w:p>
         </w:tc>
@@ -1670,7 +1759,7 @@
                 <w:sz w:val="19"/>
                 <w:szCs w:val="19"/>
               </w:rPr>
-              <w:t xml:space="preserve">Controle de Embarque</w:t>
+              <w:t xml:space="preserve">Relatórios</w:t>
             </w:r>
           </w:p>
         </w:tc>
@@ -1697,7 +1786,7 @@
                 <w:sz w:val="19"/>
                 <w:szCs w:val="19"/>
               </w:rPr>
-              <w:t xml:space="preserve">Registro de embarcou/faltou e horários.</w:t>
+              <w:t xml:space="preserve">Consultas por agendamento, dia, mês, nome e outros filtros; PDF/Excel.</w:t>
             </w:r>
           </w:p>
         </w:tc>
@@ -1724,7 +1813,7 @@
                 <w:sz w:val="19"/>
                 <w:szCs w:val="19"/>
               </w:rPr>
-              <w:t xml:space="preserve">2</w:t>
+              <w:t xml:space="preserve">4</w:t>
             </w:r>
           </w:p>
         </w:tc>
@@ -1752,7 +1841,7 @@
                 <w:sz w:val="19"/>
                 <w:szCs w:val="19"/>
               </w:rPr>
-              <w:t xml:space="preserve">Painel de Senhas</w:t>
+              <w:t xml:space="preserve">Relatório BPA</w:t>
             </w:r>
           </w:p>
         </w:tc>
@@ -1778,7 +1867,7 @@
                 <w:sz w:val="19"/>
                 <w:szCs w:val="19"/>
               </w:rPr>
-              <w:t xml:space="preserve">Emissão MT-01 a MT-50, chamadas e painel de TV.</w:t>
+              <w:t xml:space="preserve">Relatório com os campos necessários à digitação do BPA.</w:t>
             </w:r>
           </w:p>
         </w:tc>
@@ -1804,7 +1893,7 @@
                 <w:sz w:val="19"/>
                 <w:szCs w:val="19"/>
               </w:rPr>
-              <w:t xml:space="preserve">3</w:t>
+              <w:t xml:space="preserve">4</w:t>
             </w:r>
           </w:p>
         </w:tc>
@@ -1833,7 +1922,7 @@
                 <w:sz w:val="19"/>
                 <w:szCs w:val="19"/>
               </w:rPr>
-              <w:t xml:space="preserve">Relatório BPA</w:t>
+              <w:t xml:space="preserve">Pesquisa e Dashboard</w:t>
             </w:r>
           </w:p>
         </w:tc>
@@ -1860,7 +1949,7 @@
                 <w:sz w:val="19"/>
                 <w:szCs w:val="19"/>
               </w:rPr>
-              <w:t xml:space="preserve">Relatório filtrável em PDF/Excel para digitação do BPA.</w:t>
+              <w:t xml:space="preserve">Busca rápida e indicadores operacionais.</w:t>
             </w:r>
           </w:p>
         </w:tc>
@@ -1915,7 +2004,7 @@
                 <w:sz w:val="19"/>
                 <w:szCs w:val="19"/>
               </w:rPr>
-              <w:t xml:space="preserve">Pesquisa e Dashboard</w:t>
+              <w:t xml:space="preserve">Controle de Usuários</w:t>
             </w:r>
           </w:p>
         </w:tc>
@@ -1941,96 +2030,13 @@
                 <w:sz w:val="19"/>
                 <w:szCs w:val="19"/>
               </w:rPr>
-              <w:t xml:space="preserve">Busca rápida e indicadores operacionais.</w:t>
+              <w:t xml:space="preserve">Perfis e permissões (Admin, Atendente, Coordenação, Consulta).</w:t>
             </w:r>
           </w:p>
         </w:tc>
         <w:tc>
           <w:tcPr>
             <w:tcW w:type="dxa" w:w="1600"/>
-            <w:tcMar>
-              <w:top w:type="dxa" w:w="40"/>
-              <w:left w:type="dxa" w:w="90"/>
-              <w:bottom w:type="dxa" w:w="40"/>
-              <w:right w:type="dxa" w:w="90"/>
-            </w:tcMar>
-          </w:tcPr>
-          <w:p>
-            <w:pPr>
-              <w:spacing w:after="20" w:before="20" w:line="252"/>
-            </w:pPr>
-            <w:r>
-              <w:rPr>
-                <w:b w:val="false"/>
-                <w:bCs w:val="false"/>
-                <w:color w:val="000000"/>
-                <w:sz w:val="19"/>
-                <w:szCs w:val="19"/>
-              </w:rPr>
-              <w:t xml:space="preserve">4</w:t>
-            </w:r>
-          </w:p>
-        </w:tc>
-      </w:tr>
-      <w:tr>
-        <w:tc>
-          <w:tcPr>
-            <w:tcW w:type="dxa" w:w="2600"/>
-            <w:shd w:fill="F2F6FC" w:color="auto" w:val="clear"/>
-            <w:tcMar>
-              <w:top w:type="dxa" w:w="40"/>
-              <w:left w:type="dxa" w:w="90"/>
-              <w:bottom w:type="dxa" w:w="40"/>
-              <w:right w:type="dxa" w:w="90"/>
-            </w:tcMar>
-          </w:tcPr>
-          <w:p>
-            <w:pPr>
-              <w:spacing w:after="20" w:before="20" w:line="252"/>
-            </w:pPr>
-            <w:r>
-              <w:rPr>
-                <w:b w:val="false"/>
-                <w:bCs w:val="false"/>
-                <w:color w:val="000000"/>
-                <w:sz w:val="19"/>
-                <w:szCs w:val="19"/>
-              </w:rPr>
-              <w:t xml:space="preserve">Controle de Usuários</w:t>
-            </w:r>
-          </w:p>
-        </w:tc>
-        <w:tc>
-          <w:tcPr>
-            <w:tcW w:type="dxa" w:w="4820"/>
-            <w:shd w:fill="F2F6FC" w:color="auto" w:val="clear"/>
-            <w:tcMar>
-              <w:top w:type="dxa" w:w="40"/>
-              <w:left w:type="dxa" w:w="90"/>
-              <w:bottom w:type="dxa" w:w="40"/>
-              <w:right w:type="dxa" w:w="90"/>
-            </w:tcMar>
-          </w:tcPr>
-          <w:p>
-            <w:pPr>
-              <w:spacing w:after="20" w:before="20" w:line="252"/>
-            </w:pPr>
-            <w:r>
-              <w:rPr>
-                <w:b w:val="false"/>
-                <w:bCs w:val="false"/>
-                <w:color w:val="000000"/>
-                <w:sz w:val="19"/>
-                <w:szCs w:val="19"/>
-              </w:rPr>
-              <w:t xml:space="preserve">Perfis e permissões (Admin, Atendente, Coordenação, Motorista).</w:t>
-            </w:r>
-          </w:p>
-        </w:tc>
-        <w:tc>
-          <w:tcPr>
-            <w:tcW w:type="dxa" w:w="1600"/>
-            <w:shd w:fill="F2F6FC" w:color="auto" w:val="clear"/>
             <w:tcMar>
               <w:top w:type="dxa" w:w="40"/>
               <w:left w:type="dxa" w:w="90"/>
@@ -2572,7 +2578,7 @@
           <w:sz w:val="21"/>
           <w:szCs w:val="21"/>
         </w:rPr>
-        <w:t xml:space="preserve">Navegador (Atendente / Coordenação / Motorista / Painel de TV)</w:t>
+        <w:t xml:space="preserve">Navegador (Atendente / Coordenação / Painel de TV)</w:t>
       </w:r>
     </w:p>
     <w:p>
@@ -3480,7 +3486,7 @@
           <w:sz w:val="21"/>
           <w:szCs w:val="21"/>
         </w:rPr>
-        <w:t xml:space="preserve">O modelo foi derivado diretamente dos formulários reais. A distinção central é entre Agendamento (a marcação individual de um paciente) e Viagem (o veículo indo a um destino, em uma data, com capacidade limitada). Essa separação viabiliza o mapa de viagem e o controle de lotação.</w:t>
+        <w:t xml:space="preserve">O modelo foi derivado diretamente dos formulários reais. O elemento central é o Agendamento (a marcação individual de um paciente), organizado em uma Agenda por data e horário. Cada agendamento ocupa um horário dentro da janela de atendimento (06:00 às 16:30, de segunda a sexta), e os agendamentos são exibidos em ordem de horário — o que gera a Lista do Dia.</w:t>
       </w:r>
     </w:p>
     <w:p>
@@ -5205,7 +5211,19 @@
           <w:sz w:val="25"/>
           <w:szCs w:val="25"/>
         </w:rPr>
-        <w:t xml:space="preserve">7.3. Entidade: Veículo</w:t>
+        <w:t xml:space="preserve">7.3. Agenda de Horários</w:t>
+      </w:r>
+    </w:p>
+    <w:p>
+      <w:pPr>
+        <w:spacing w:after="120" w:line="276"/>
+      </w:pPr>
+      <w:r>
+        <w:rPr>
+          <w:sz w:val="21"/>
+          <w:szCs w:val="21"/>
+        </w:rPr>
+        <w:t xml:space="preserve">A agenda organiza os agendamentos por data e por horário. A janela de atendimento vai das 06:00 às 16:30, apenas em dias úteis (segunda a sexta). Não há entidade separada para a agenda: ela resulta da consulta dos agendamentos por data, ordenados por horário.</w:t>
       </w:r>
     </w:p>
     <w:tbl>
@@ -5222,8 +5240,8 @@
       </w:tblPr>
       <w:tblGrid>
         <w:gridCol w:w="2600"/>
-        <w:gridCol w:w="1800"/>
-        <w:gridCol w:w="4620"/>
+        <w:gridCol w:w="2400"/>
+        <w:gridCol w:w="4020"/>
       </w:tblGrid>
       <w:tr>
         <w:trPr>
@@ -5252,13 +5270,13 @@
                 <w:sz w:val="19"/>
                 <w:szCs w:val="19"/>
               </w:rPr>
-              <w:t xml:space="preserve">Campo</w:t>
-            </w:r>
-          </w:p>
-        </w:tc>
-        <w:tc>
-          <w:tcPr>
-            <w:tcW w:type="dxa" w:w="1800"/>
+              <w:t xml:space="preserve">Parâmetro</w:t>
+            </w:r>
+          </w:p>
+        </w:tc>
+        <w:tc>
+          <w:tcPr>
+            <w:tcW w:type="dxa" w:w="2400"/>
             <w:shd w:fill="2E74B5" w:color="auto" w:val="clear"/>
             <w:tcMar>
               <w:top w:type="dxa" w:w="40"/>
@@ -5279,13 +5297,13 @@
                 <w:sz w:val="19"/>
                 <w:szCs w:val="19"/>
               </w:rPr>
-              <w:t xml:space="preserve">Tipo</w:t>
-            </w:r>
-          </w:p>
-        </w:tc>
-        <w:tc>
-          <w:tcPr>
-            <w:tcW w:type="dxa" w:w="4620"/>
+              <w:t xml:space="preserve">Definição</w:t>
+            </w:r>
+          </w:p>
+        </w:tc>
+        <w:tc>
+          <w:tcPr>
+            <w:tcW w:type="dxa" w:w="4020"/>
             <w:shd w:fill="2E74B5" w:color="auto" w:val="clear"/>
             <w:tcMar>
               <w:top w:type="dxa" w:w="40"/>
@@ -5334,59 +5352,59 @@
                 <w:sz w:val="19"/>
                 <w:szCs w:val="19"/>
               </w:rPr>
-              <w:t xml:space="preserve">Placa</w:t>
-            </w:r>
-          </w:p>
-        </w:tc>
-        <w:tc>
-          <w:tcPr>
-            <w:tcW w:type="dxa" w:w="1800"/>
-            <w:tcMar>
-              <w:top w:type="dxa" w:w="40"/>
-              <w:left w:type="dxa" w:w="90"/>
-              <w:bottom w:type="dxa" w:w="40"/>
-              <w:right w:type="dxa" w:w="90"/>
-            </w:tcMar>
-          </w:tcPr>
-          <w:p>
-            <w:pPr>
-              <w:spacing w:after="20" w:before="20" w:line="252"/>
-            </w:pPr>
-            <w:r>
-              <w:rPr>
-                <w:b w:val="false"/>
-                <w:bCs w:val="false"/>
-                <w:color w:val="000000"/>
-                <w:sz w:val="19"/>
-                <w:szCs w:val="19"/>
-              </w:rPr>
-              <w:t xml:space="preserve">Texto</w:t>
-            </w:r>
-          </w:p>
-        </w:tc>
-        <w:tc>
-          <w:tcPr>
-            <w:tcW w:type="dxa" w:w="4620"/>
-            <w:tcMar>
-              <w:top w:type="dxa" w:w="40"/>
-              <w:left w:type="dxa" w:w="90"/>
-              <w:bottom w:type="dxa" w:w="40"/>
-              <w:right w:type="dxa" w:w="90"/>
-            </w:tcMar>
-          </w:tcPr>
-          <w:p>
-            <w:pPr>
-              <w:spacing w:after="20" w:before="20" w:line="252"/>
-            </w:pPr>
-            <w:r>
-              <w:rPr>
-                <w:b w:val="false"/>
-                <w:bCs w:val="false"/>
-                <w:color w:val="000000"/>
-                <w:sz w:val="19"/>
-                <w:szCs w:val="19"/>
-              </w:rPr>
-              <w:t xml:space="preserve">Identificador.</w:t>
+              <w:t xml:space="preserve">Janela de atendimento</w:t>
+            </w:r>
+          </w:p>
+        </w:tc>
+        <w:tc>
+          <w:tcPr>
+            <w:tcW w:type="dxa" w:w="2400"/>
+            <w:tcMar>
+              <w:top w:type="dxa" w:w="40"/>
+              <w:left w:type="dxa" w:w="90"/>
+              <w:bottom w:type="dxa" w:w="40"/>
+              <w:right w:type="dxa" w:w="90"/>
+            </w:tcMar>
+          </w:tcPr>
+          <w:p>
+            <w:pPr>
+              <w:spacing w:after="20" w:before="20" w:line="252"/>
+            </w:pPr>
+            <w:r>
+              <w:rPr>
+                <w:b w:val="false"/>
+                <w:bCs w:val="false"/>
+                <w:color w:val="000000"/>
+                <w:sz w:val="19"/>
+                <w:szCs w:val="19"/>
+              </w:rPr>
+              <w:t xml:space="preserve">06:00 às 16:30</w:t>
+            </w:r>
+          </w:p>
+        </w:tc>
+        <w:tc>
+          <w:tcPr>
+            <w:tcW w:type="dxa" w:w="4020"/>
+            <w:tcMar>
+              <w:top w:type="dxa" w:w="40"/>
+              <w:left w:type="dxa" w:w="90"/>
+              <w:bottom w:type="dxa" w:w="40"/>
+              <w:right w:type="dxa" w:w="90"/>
+            </w:tcMar>
+          </w:tcPr>
+          <w:p>
+            <w:pPr>
+              <w:spacing w:after="20" w:before="20" w:line="252"/>
+            </w:pPr>
+            <w:r>
+              <w:rPr>
+                <w:b w:val="false"/>
+                <w:bCs w:val="false"/>
+                <w:color w:val="000000"/>
+                <w:sz w:val="19"/>
+                <w:szCs w:val="19"/>
+              </w:rPr>
+              <w:t xml:space="preserve">Segunda a sexta-feira.</w:t>
             </w:r>
           </w:p>
         </w:tc>
@@ -5415,61 +5433,61 @@
                 <w:sz w:val="19"/>
                 <w:szCs w:val="19"/>
               </w:rPr>
-              <w:t xml:space="preserve">Tipo</w:t>
-            </w:r>
-          </w:p>
-        </w:tc>
-        <w:tc>
-          <w:tcPr>
-            <w:tcW w:type="dxa" w:w="1800"/>
-            <w:shd w:fill="F2F6FC" w:color="auto" w:val="clear"/>
-            <w:tcMar>
-              <w:top w:type="dxa" w:w="40"/>
-              <w:left w:type="dxa" w:w="90"/>
-              <w:bottom w:type="dxa" w:w="40"/>
-              <w:right w:type="dxa" w:w="90"/>
-            </w:tcMar>
-          </w:tcPr>
-          <w:p>
-            <w:pPr>
-              <w:spacing w:after="20" w:before="20" w:line="252"/>
-            </w:pPr>
-            <w:r>
-              <w:rPr>
-                <w:b w:val="false"/>
-                <w:bCs w:val="false"/>
-                <w:color w:val="000000"/>
-                <w:sz w:val="19"/>
-                <w:szCs w:val="19"/>
-              </w:rPr>
-              <w:t xml:space="preserve">Lista</w:t>
-            </w:r>
-          </w:p>
-        </w:tc>
-        <w:tc>
-          <w:tcPr>
-            <w:tcW w:type="dxa" w:w="4620"/>
-            <w:shd w:fill="F2F6FC" w:color="auto" w:val="clear"/>
-            <w:tcMar>
-              <w:top w:type="dxa" w:w="40"/>
-              <w:left w:type="dxa" w:w="90"/>
-              <w:bottom w:type="dxa" w:w="40"/>
-              <w:right w:type="dxa" w:w="90"/>
-            </w:tcMar>
-          </w:tcPr>
-          <w:p>
-            <w:pPr>
-              <w:spacing w:after="20" w:before="20" w:line="252"/>
-            </w:pPr>
-            <w:r>
-              <w:rPr>
-                <w:b w:val="false"/>
-                <w:bCs w:val="false"/>
-                <w:color w:val="000000"/>
-                <w:sz w:val="19"/>
-                <w:szCs w:val="19"/>
-              </w:rPr>
-              <w:t xml:space="preserve">Van, Ambulância, Automóvel, Micro-ônibus, Ônibus.</w:t>
+              <w:t xml:space="preserve">Granularidade dos horários</w:t>
+            </w:r>
+          </w:p>
+        </w:tc>
+        <w:tc>
+          <w:tcPr>
+            <w:tcW w:type="dxa" w:w="2400"/>
+            <w:shd w:fill="F2F6FC" w:color="auto" w:val="clear"/>
+            <w:tcMar>
+              <w:top w:type="dxa" w:w="40"/>
+              <w:left w:type="dxa" w:w="90"/>
+              <w:bottom w:type="dxa" w:w="40"/>
+              <w:right w:type="dxa" w:w="90"/>
+            </w:tcMar>
+          </w:tcPr>
+          <w:p>
+            <w:pPr>
+              <w:spacing w:after="20" w:before="20" w:line="252"/>
+            </w:pPr>
+            <w:r>
+              <w:rPr>
+                <w:b w:val="false"/>
+                <w:bCs w:val="false"/>
+                <w:color w:val="000000"/>
+                <w:sz w:val="19"/>
+                <w:szCs w:val="19"/>
+              </w:rPr>
+              <w:t xml:space="preserve">Configurável</w:t>
+            </w:r>
+          </w:p>
+        </w:tc>
+        <w:tc>
+          <w:tcPr>
+            <w:tcW w:type="dxa" w:w="4020"/>
+            <w:shd w:fill="F2F6FC" w:color="auto" w:val="clear"/>
+            <w:tcMar>
+              <w:top w:type="dxa" w:w="40"/>
+              <w:left w:type="dxa" w:w="90"/>
+              <w:bottom w:type="dxa" w:w="40"/>
+              <w:right w:type="dxa" w:w="90"/>
+            </w:tcMar>
+          </w:tcPr>
+          <w:p>
+            <w:pPr>
+              <w:spacing w:after="20" w:before="20" w:line="252"/>
+            </w:pPr>
+            <w:r>
+              <w:rPr>
+                <w:b w:val="false"/>
+                <w:bCs w:val="false"/>
+                <w:color w:val="000000"/>
+                <w:sz w:val="19"/>
+                <w:szCs w:val="19"/>
+              </w:rPr>
+              <w:t xml:space="preserve">Ex.: de 30 em 30 min, ou horário livre — a confirmar.</w:t>
             </w:r>
           </w:p>
         </w:tc>
@@ -5497,59 +5515,59 @@
                 <w:sz w:val="19"/>
                 <w:szCs w:val="19"/>
               </w:rPr>
-              <w:t xml:space="preserve">Marca / Modelo / Ano</w:t>
-            </w:r>
-          </w:p>
-        </w:tc>
-        <w:tc>
-          <w:tcPr>
-            <w:tcW w:type="dxa" w:w="1800"/>
-            <w:tcMar>
-              <w:top w:type="dxa" w:w="40"/>
-              <w:left w:type="dxa" w:w="90"/>
-              <w:bottom w:type="dxa" w:w="40"/>
-              <w:right w:type="dxa" w:w="90"/>
-            </w:tcMar>
-          </w:tcPr>
-          <w:p>
-            <w:pPr>
-              <w:spacing w:after="20" w:before="20" w:line="252"/>
-            </w:pPr>
-            <w:r>
-              <w:rPr>
-                <w:b w:val="false"/>
-                <w:bCs w:val="false"/>
-                <w:color w:val="000000"/>
-                <w:sz w:val="19"/>
-                <w:szCs w:val="19"/>
-              </w:rPr>
-              <w:t xml:space="preserve">Texto/Núm.</w:t>
-            </w:r>
-          </w:p>
-        </w:tc>
-        <w:tc>
-          <w:tcPr>
-            <w:tcW w:type="dxa" w:w="4620"/>
-            <w:tcMar>
-              <w:top w:type="dxa" w:w="40"/>
-              <w:left w:type="dxa" w:w="90"/>
-              <w:bottom w:type="dxa" w:w="40"/>
-              <w:right w:type="dxa" w:w="90"/>
-            </w:tcMar>
-          </w:tcPr>
-          <w:p>
-            <w:pPr>
-              <w:spacing w:after="20" w:before="20" w:line="252"/>
-            </w:pPr>
-            <w:r>
-              <w:rPr>
-                <w:b w:val="false"/>
-                <w:bCs w:val="false"/>
-                <w:color w:val="000000"/>
-                <w:sz w:val="19"/>
-                <w:szCs w:val="19"/>
-              </w:rPr>
-              <w:t xml:space="preserve"/>
+              <w:t xml:space="preserve">Capacidade por horário</w:t>
+            </w:r>
+          </w:p>
+        </w:tc>
+        <w:tc>
+          <w:tcPr>
+            <w:tcW w:type="dxa" w:w="2400"/>
+            <w:tcMar>
+              <w:top w:type="dxa" w:w="40"/>
+              <w:left w:type="dxa" w:w="90"/>
+              <w:bottom w:type="dxa" w:w="40"/>
+              <w:right w:type="dxa" w:w="90"/>
+            </w:tcMar>
+          </w:tcPr>
+          <w:p>
+            <w:pPr>
+              <w:spacing w:after="20" w:before="20" w:line="252"/>
+            </w:pPr>
+            <w:r>
+              <w:rPr>
+                <w:b w:val="false"/>
+                <w:bCs w:val="false"/>
+                <w:color w:val="000000"/>
+                <w:sz w:val="19"/>
+                <w:szCs w:val="19"/>
+              </w:rPr>
+              <w:t xml:space="preserve">Configurável</w:t>
+            </w:r>
+          </w:p>
+        </w:tc>
+        <w:tc>
+          <w:tcPr>
+            <w:tcW w:type="dxa" w:w="4020"/>
+            <w:tcMar>
+              <w:top w:type="dxa" w:w="40"/>
+              <w:left w:type="dxa" w:w="90"/>
+              <w:bottom w:type="dxa" w:w="40"/>
+              <w:right w:type="dxa" w:w="90"/>
+            </w:tcMar>
+          </w:tcPr>
+          <w:p>
+            <w:pPr>
+              <w:spacing w:after="20" w:before="20" w:line="252"/>
+            </w:pPr>
+            <w:r>
+              <w:rPr>
+                <w:b w:val="false"/>
+                <w:bCs w:val="false"/>
+                <w:color w:val="000000"/>
+                <w:sz w:val="19"/>
+                <w:szCs w:val="19"/>
+              </w:rPr>
+              <w:t xml:space="preserve">Quantos pacientes por horário — a Secretaria define.</w:t>
             </w:r>
           </w:p>
         </w:tc>
@@ -5578,224 +5596,61 @@
                 <w:sz w:val="19"/>
                 <w:szCs w:val="19"/>
               </w:rPr>
-              <w:t xml:space="preserve">Lotação</w:t>
-            </w:r>
-          </w:p>
-        </w:tc>
-        <w:tc>
-          <w:tcPr>
-            <w:tcW w:type="dxa" w:w="1800"/>
-            <w:shd w:fill="F2F6FC" w:color="auto" w:val="clear"/>
-            <w:tcMar>
-              <w:top w:type="dxa" w:w="40"/>
-              <w:left w:type="dxa" w:w="90"/>
-              <w:bottom w:type="dxa" w:w="40"/>
-              <w:right w:type="dxa" w:w="90"/>
-            </w:tcMar>
-          </w:tcPr>
-          <w:p>
-            <w:pPr>
-              <w:spacing w:after="20" w:before="20" w:line="252"/>
-            </w:pPr>
-            <w:r>
-              <w:rPr>
-                <w:b w:val="false"/>
-                <w:bCs w:val="false"/>
-                <w:color w:val="000000"/>
-                <w:sz w:val="19"/>
-                <w:szCs w:val="19"/>
-              </w:rPr>
-              <w:t xml:space="preserve">Inteiro</w:t>
-            </w:r>
-          </w:p>
-        </w:tc>
-        <w:tc>
-          <w:tcPr>
-            <w:tcW w:type="dxa" w:w="4620"/>
-            <w:shd w:fill="F2F6FC" w:color="auto" w:val="clear"/>
-            <w:tcMar>
-              <w:top w:type="dxa" w:w="40"/>
-              <w:left w:type="dxa" w:w="90"/>
-              <w:bottom w:type="dxa" w:w="40"/>
-              <w:right w:type="dxa" w:w="90"/>
-            </w:tcMar>
-          </w:tcPr>
-          <w:p>
-            <w:pPr>
-              <w:spacing w:after="20" w:before="20" w:line="252"/>
-            </w:pPr>
-            <w:r>
-              <w:rPr>
-                <w:b w:val="false"/>
-                <w:bCs w:val="false"/>
-                <w:color w:val="000000"/>
-                <w:sz w:val="19"/>
-                <w:szCs w:val="19"/>
-              </w:rPr>
-              <w:t xml:space="preserve">Capacidade (ex.: 20) — base do controle de vagas.</w:t>
-            </w:r>
-          </w:p>
-        </w:tc>
-      </w:tr>
-      <w:tr>
-        <w:tc>
-          <w:tcPr>
-            <w:tcW w:type="dxa" w:w="2600"/>
-            <w:tcMar>
-              <w:top w:type="dxa" w:w="40"/>
-              <w:left w:type="dxa" w:w="90"/>
-              <w:bottom w:type="dxa" w:w="40"/>
-              <w:right w:type="dxa" w:w="90"/>
-            </w:tcMar>
-          </w:tcPr>
-          <w:p>
-            <w:pPr>
-              <w:spacing w:after="20" w:before="20" w:line="252"/>
-            </w:pPr>
-            <w:r>
-              <w:rPr>
-                <w:b w:val="false"/>
-                <w:bCs w:val="false"/>
-                <w:color w:val="000000"/>
-                <w:sz w:val="19"/>
-                <w:szCs w:val="19"/>
-              </w:rPr>
-              <w:t xml:space="preserve">Quilometragem</w:t>
-            </w:r>
-          </w:p>
-        </w:tc>
-        <w:tc>
-          <w:tcPr>
-            <w:tcW w:type="dxa" w:w="1800"/>
-            <w:tcMar>
-              <w:top w:type="dxa" w:w="40"/>
-              <w:left w:type="dxa" w:w="90"/>
-              <w:bottom w:type="dxa" w:w="40"/>
-              <w:right w:type="dxa" w:w="90"/>
-            </w:tcMar>
-          </w:tcPr>
-          <w:p>
-            <w:pPr>
-              <w:spacing w:after="20" w:before="20" w:line="252"/>
-            </w:pPr>
-            <w:r>
-              <w:rPr>
-                <w:b w:val="false"/>
-                <w:bCs w:val="false"/>
-                <w:color w:val="000000"/>
-                <w:sz w:val="19"/>
-                <w:szCs w:val="19"/>
-              </w:rPr>
-              <w:t xml:space="preserve">Inteiro</w:t>
-            </w:r>
-          </w:p>
-        </w:tc>
-        <w:tc>
-          <w:tcPr>
-            <w:tcW w:type="dxa" w:w="4620"/>
-            <w:tcMar>
-              <w:top w:type="dxa" w:w="40"/>
-              <w:left w:type="dxa" w:w="90"/>
-              <w:bottom w:type="dxa" w:w="40"/>
-              <w:right w:type="dxa" w:w="90"/>
-            </w:tcMar>
-          </w:tcPr>
-          <w:p>
-            <w:pPr>
-              <w:spacing w:after="20" w:before="20" w:line="252"/>
-            </w:pPr>
-            <w:r>
-              <w:rPr>
-                <w:b w:val="false"/>
-                <w:bCs w:val="false"/>
-                <w:color w:val="000000"/>
-                <w:sz w:val="19"/>
-                <w:szCs w:val="19"/>
-              </w:rPr>
-              <w:t xml:space="preserve"/>
-            </w:r>
-          </w:p>
-        </w:tc>
-      </w:tr>
-      <w:tr>
-        <w:tc>
-          <w:tcPr>
-            <w:tcW w:type="dxa" w:w="2600"/>
-            <w:shd w:fill="F2F6FC" w:color="auto" w:val="clear"/>
-            <w:tcMar>
-              <w:top w:type="dxa" w:w="40"/>
-              <w:left w:type="dxa" w:w="90"/>
-              <w:bottom w:type="dxa" w:w="40"/>
-              <w:right w:type="dxa" w:w="90"/>
-            </w:tcMar>
-          </w:tcPr>
-          <w:p>
-            <w:pPr>
-              <w:spacing w:after="20" w:before="20" w:line="252"/>
-            </w:pPr>
-            <w:r>
-              <w:rPr>
-                <w:b w:val="false"/>
-                <w:bCs w:val="false"/>
-                <w:color w:val="000000"/>
-                <w:sz w:val="19"/>
-                <w:szCs w:val="19"/>
-              </w:rPr>
-              <w:t xml:space="preserve">Situação</w:t>
-            </w:r>
-          </w:p>
-        </w:tc>
-        <w:tc>
-          <w:tcPr>
-            <w:tcW w:type="dxa" w:w="1800"/>
-            <w:shd w:fill="F2F6FC" w:color="auto" w:val="clear"/>
-            <w:tcMar>
-              <w:top w:type="dxa" w:w="40"/>
-              <w:left w:type="dxa" w:w="90"/>
-              <w:bottom w:type="dxa" w:w="40"/>
-              <w:right w:type="dxa" w:w="90"/>
-            </w:tcMar>
-          </w:tcPr>
-          <w:p>
-            <w:pPr>
-              <w:spacing w:after="20" w:before="20" w:line="252"/>
-            </w:pPr>
-            <w:r>
-              <w:rPr>
-                <w:b w:val="false"/>
-                <w:bCs w:val="false"/>
-                <w:color w:val="000000"/>
-                <w:sz w:val="19"/>
-                <w:szCs w:val="19"/>
-              </w:rPr>
-              <w:t xml:space="preserve">Lista</w:t>
-            </w:r>
-          </w:p>
-        </w:tc>
-        <w:tc>
-          <w:tcPr>
-            <w:tcW w:type="dxa" w:w="4620"/>
-            <w:shd w:fill="F2F6FC" w:color="auto" w:val="clear"/>
-            <w:tcMar>
-              <w:top w:type="dxa" w:w="40"/>
-              <w:left w:type="dxa" w:w="90"/>
-              <w:bottom w:type="dxa" w:w="40"/>
-              <w:right w:type="dxa" w:w="90"/>
-            </w:tcMar>
-          </w:tcPr>
-          <w:p>
-            <w:pPr>
-              <w:spacing w:after="20" w:before="20" w:line="252"/>
-            </w:pPr>
-            <w:r>
-              <w:rPr>
-                <w:b w:val="false"/>
-                <w:bCs w:val="false"/>
-                <w:color w:val="000000"/>
-                <w:sz w:val="19"/>
-                <w:szCs w:val="19"/>
-              </w:rPr>
-              <w:t xml:space="preserve">Ativo, Manutenção, Inativo.</w:t>
+              <w:t xml:space="preserve">Ordenação</w:t>
+            </w:r>
+          </w:p>
+        </w:tc>
+        <w:tc>
+          <w:tcPr>
+            <w:tcW w:type="dxa" w:w="2400"/>
+            <w:shd w:fill="F2F6FC" w:color="auto" w:val="clear"/>
+            <w:tcMar>
+              <w:top w:type="dxa" w:w="40"/>
+              <w:left w:type="dxa" w:w="90"/>
+              <w:bottom w:type="dxa" w:w="40"/>
+              <w:right w:type="dxa" w:w="90"/>
+            </w:tcMar>
+          </w:tcPr>
+          <w:p>
+            <w:pPr>
+              <w:spacing w:after="20" w:before="20" w:line="252"/>
+            </w:pPr>
+            <w:r>
+              <w:rPr>
+                <w:b w:val="false"/>
+                <w:bCs w:val="false"/>
+                <w:color w:val="000000"/>
+                <w:sz w:val="19"/>
+                <w:szCs w:val="19"/>
+              </w:rPr>
+              <w:t xml:space="preserve">Por horário</w:t>
+            </w:r>
+          </w:p>
+        </w:tc>
+        <w:tc>
+          <w:tcPr>
+            <w:tcW w:type="dxa" w:w="4020"/>
+            <w:shd w:fill="F2F6FC" w:color="auto" w:val="clear"/>
+            <w:tcMar>
+              <w:top w:type="dxa" w:w="40"/>
+              <w:left w:type="dxa" w:w="90"/>
+              <w:bottom w:type="dxa" w:w="40"/>
+              <w:right w:type="dxa" w:w="90"/>
+            </w:tcMar>
+          </w:tcPr>
+          <w:p>
+            <w:pPr>
+              <w:spacing w:after="20" w:before="20" w:line="252"/>
+            </w:pPr>
+            <w:r>
+              <w:rPr>
+                <w:b w:val="false"/>
+                <w:bCs w:val="false"/>
+                <w:color w:val="000000"/>
+                <w:sz w:val="19"/>
+                <w:szCs w:val="19"/>
+              </w:rPr>
+              <w:t xml:space="preserve">Agendamentos exibidos em ordem crescente de horário.</w:t>
             </w:r>
           </w:p>
         </w:tc>
@@ -5814,453 +5669,7 @@
           <w:sz w:val="25"/>
           <w:szCs w:val="25"/>
         </w:rPr>
-        <w:t xml:space="preserve">7.4. Entidade: Motorista</w:t>
-      </w:r>
-    </w:p>
-    <w:tbl>
-      <w:tblPr>
-        <w:tblW w:type="dxa" w:w="9020"/>
-        <w:tblBorders>
-          <w:top w:val="single" w:color="BFBFBF" w:sz="2"/>
-          <w:left w:val="single" w:color="BFBFBF" w:sz="2"/>
-          <w:bottom w:val="single" w:color="BFBFBF" w:sz="2"/>
-          <w:right w:val="single" w:color="BFBFBF" w:sz="2"/>
-          <w:insideH w:val="single" w:color="D9D9D9" w:sz="2"/>
-          <w:insideV w:val="single" w:color="D9D9D9" w:sz="2"/>
-        </w:tblBorders>
-      </w:tblPr>
-      <w:tblGrid>
-        <w:gridCol w:w="2600"/>
-        <w:gridCol w:w="1800"/>
-        <w:gridCol w:w="4620"/>
-      </w:tblGrid>
-      <w:tr>
-        <w:trPr>
-          <w:tblHeader/>
-        </w:trPr>
-        <w:tc>
-          <w:tcPr>
-            <w:tcW w:type="dxa" w:w="2600"/>
-            <w:shd w:fill="2E74B5" w:color="auto" w:val="clear"/>
-            <w:tcMar>
-              <w:top w:type="dxa" w:w="40"/>
-              <w:left w:type="dxa" w:w="90"/>
-              <w:bottom w:type="dxa" w:w="40"/>
-              <w:right w:type="dxa" w:w="90"/>
-            </w:tcMar>
-          </w:tcPr>
-          <w:p>
-            <w:pPr>
-              <w:spacing w:after="20" w:before="20" w:line="252"/>
-            </w:pPr>
-            <w:r>
-              <w:rPr>
-                <w:b/>
-                <w:bCs/>
-                <w:color w:val="FFFFFF"/>
-                <w:sz w:val="19"/>
-                <w:szCs w:val="19"/>
-              </w:rPr>
-              <w:t xml:space="preserve">Campo</w:t>
-            </w:r>
-          </w:p>
-        </w:tc>
-        <w:tc>
-          <w:tcPr>
-            <w:tcW w:type="dxa" w:w="1800"/>
-            <w:shd w:fill="2E74B5" w:color="auto" w:val="clear"/>
-            <w:tcMar>
-              <w:top w:type="dxa" w:w="40"/>
-              <w:left w:type="dxa" w:w="90"/>
-              <w:bottom w:type="dxa" w:w="40"/>
-              <w:right w:type="dxa" w:w="90"/>
-            </w:tcMar>
-          </w:tcPr>
-          <w:p>
-            <w:pPr>
-              <w:spacing w:after="20" w:before="20" w:line="252"/>
-            </w:pPr>
-            <w:r>
-              <w:rPr>
-                <w:b/>
-                <w:bCs/>
-                <w:color w:val="FFFFFF"/>
-                <w:sz w:val="19"/>
-                <w:szCs w:val="19"/>
-              </w:rPr>
-              <w:t xml:space="preserve">Tipo</w:t>
-            </w:r>
-          </w:p>
-        </w:tc>
-        <w:tc>
-          <w:tcPr>
-            <w:tcW w:type="dxa" w:w="4620"/>
-            <w:shd w:fill="2E74B5" w:color="auto" w:val="clear"/>
-            <w:tcMar>
-              <w:top w:type="dxa" w:w="40"/>
-              <w:left w:type="dxa" w:w="90"/>
-              <w:bottom w:type="dxa" w:w="40"/>
-              <w:right w:type="dxa" w:w="90"/>
-            </w:tcMar>
-          </w:tcPr>
-          <w:p>
-            <w:pPr>
-              <w:spacing w:after="20" w:before="20" w:line="252"/>
-            </w:pPr>
-            <w:r>
-              <w:rPr>
-                <w:b/>
-                <w:bCs/>
-                <w:color w:val="FFFFFF"/>
-                <w:sz w:val="19"/>
-                <w:szCs w:val="19"/>
-              </w:rPr>
-              <w:t xml:space="preserve">Observação</w:t>
-            </w:r>
-          </w:p>
-        </w:tc>
-      </w:tr>
-      <w:tr>
-        <w:tc>
-          <w:tcPr>
-            <w:tcW w:type="dxa" w:w="2600"/>
-            <w:tcMar>
-              <w:top w:type="dxa" w:w="40"/>
-              <w:left w:type="dxa" w:w="90"/>
-              <w:bottom w:type="dxa" w:w="40"/>
-              <w:right w:type="dxa" w:w="90"/>
-            </w:tcMar>
-          </w:tcPr>
-          <w:p>
-            <w:pPr>
-              <w:spacing w:after="20" w:before="20" w:line="252"/>
-            </w:pPr>
-            <w:r>
-              <w:rPr>
-                <w:b w:val="false"/>
-                <w:bCs w:val="false"/>
-                <w:color w:val="000000"/>
-                <w:sz w:val="19"/>
-                <w:szCs w:val="19"/>
-              </w:rPr>
-              <w:t xml:space="preserve">Nome / Matrícula</w:t>
-            </w:r>
-          </w:p>
-        </w:tc>
-        <w:tc>
-          <w:tcPr>
-            <w:tcW w:type="dxa" w:w="1800"/>
-            <w:tcMar>
-              <w:top w:type="dxa" w:w="40"/>
-              <w:left w:type="dxa" w:w="90"/>
-              <w:bottom w:type="dxa" w:w="40"/>
-              <w:right w:type="dxa" w:w="90"/>
-            </w:tcMar>
-          </w:tcPr>
-          <w:p>
-            <w:pPr>
-              <w:spacing w:after="20" w:before="20" w:line="252"/>
-            </w:pPr>
-            <w:r>
-              <w:rPr>
-                <w:b w:val="false"/>
-                <w:bCs w:val="false"/>
-                <w:color w:val="000000"/>
-                <w:sz w:val="19"/>
-                <w:szCs w:val="19"/>
-              </w:rPr>
-              <w:t xml:space="preserve">Texto</w:t>
-            </w:r>
-          </w:p>
-        </w:tc>
-        <w:tc>
-          <w:tcPr>
-            <w:tcW w:type="dxa" w:w="4620"/>
-            <w:tcMar>
-              <w:top w:type="dxa" w:w="40"/>
-              <w:left w:type="dxa" w:w="90"/>
-              <w:bottom w:type="dxa" w:w="40"/>
-              <w:right w:type="dxa" w:w="90"/>
-            </w:tcMar>
-          </w:tcPr>
-          <w:p>
-            <w:pPr>
-              <w:spacing w:after="20" w:before="20" w:line="252"/>
-            </w:pPr>
-            <w:r>
-              <w:rPr>
-                <w:b w:val="false"/>
-                <w:bCs w:val="false"/>
-                <w:color w:val="000000"/>
-                <w:sz w:val="19"/>
-                <w:szCs w:val="19"/>
-              </w:rPr>
-              <w:t xml:space="preserve"/>
-            </w:r>
-          </w:p>
-        </w:tc>
-      </w:tr>
-      <w:tr>
-        <w:tc>
-          <w:tcPr>
-            <w:tcW w:type="dxa" w:w="2600"/>
-            <w:shd w:fill="F2F6FC" w:color="auto" w:val="clear"/>
-            <w:tcMar>
-              <w:top w:type="dxa" w:w="40"/>
-              <w:left w:type="dxa" w:w="90"/>
-              <w:bottom w:type="dxa" w:w="40"/>
-              <w:right w:type="dxa" w:w="90"/>
-            </w:tcMar>
-          </w:tcPr>
-          <w:p>
-            <w:pPr>
-              <w:spacing w:after="20" w:before="20" w:line="252"/>
-            </w:pPr>
-            <w:r>
-              <w:rPr>
-                <w:b w:val="false"/>
-                <w:bCs w:val="false"/>
-                <w:color w:val="000000"/>
-                <w:sz w:val="19"/>
-                <w:szCs w:val="19"/>
-              </w:rPr>
-              <w:t xml:space="preserve">Telefone</w:t>
-            </w:r>
-          </w:p>
-        </w:tc>
-        <w:tc>
-          <w:tcPr>
-            <w:tcW w:type="dxa" w:w="1800"/>
-            <w:shd w:fill="F2F6FC" w:color="auto" w:val="clear"/>
-            <w:tcMar>
-              <w:top w:type="dxa" w:w="40"/>
-              <w:left w:type="dxa" w:w="90"/>
-              <w:bottom w:type="dxa" w:w="40"/>
-              <w:right w:type="dxa" w:w="90"/>
-            </w:tcMar>
-          </w:tcPr>
-          <w:p>
-            <w:pPr>
-              <w:spacing w:after="20" w:before="20" w:line="252"/>
-            </w:pPr>
-            <w:r>
-              <w:rPr>
-                <w:b w:val="false"/>
-                <w:bCs w:val="false"/>
-                <w:color w:val="000000"/>
-                <w:sz w:val="19"/>
-                <w:szCs w:val="19"/>
-              </w:rPr>
-              <w:t xml:space="preserve">Texto</w:t>
-            </w:r>
-          </w:p>
-        </w:tc>
-        <w:tc>
-          <w:tcPr>
-            <w:tcW w:type="dxa" w:w="4620"/>
-            <w:shd w:fill="F2F6FC" w:color="auto" w:val="clear"/>
-            <w:tcMar>
-              <w:top w:type="dxa" w:w="40"/>
-              <w:left w:type="dxa" w:w="90"/>
-              <w:bottom w:type="dxa" w:w="40"/>
-              <w:right w:type="dxa" w:w="90"/>
-            </w:tcMar>
-          </w:tcPr>
-          <w:p>
-            <w:pPr>
-              <w:spacing w:after="20" w:before="20" w:line="252"/>
-            </w:pPr>
-            <w:r>
-              <w:rPr>
-                <w:b w:val="false"/>
-                <w:bCs w:val="false"/>
-                <w:color w:val="000000"/>
-                <w:sz w:val="19"/>
-                <w:szCs w:val="19"/>
-              </w:rPr>
-              <w:t xml:space="preserve"/>
-            </w:r>
-          </w:p>
-        </w:tc>
-      </w:tr>
-      <w:tr>
-        <w:tc>
-          <w:tcPr>
-            <w:tcW w:type="dxa" w:w="2600"/>
-            <w:tcMar>
-              <w:top w:type="dxa" w:w="40"/>
-              <w:left w:type="dxa" w:w="90"/>
-              <w:bottom w:type="dxa" w:w="40"/>
-              <w:right w:type="dxa" w:w="90"/>
-            </w:tcMar>
-          </w:tcPr>
-          <w:p>
-            <w:pPr>
-              <w:spacing w:after="20" w:before="20" w:line="252"/>
-            </w:pPr>
-            <w:r>
-              <w:rPr>
-                <w:b w:val="false"/>
-                <w:bCs w:val="false"/>
-                <w:color w:val="000000"/>
-                <w:sz w:val="19"/>
-                <w:szCs w:val="19"/>
-              </w:rPr>
-              <w:t xml:space="preserve">CNH / Categoria / Validade</w:t>
-            </w:r>
-          </w:p>
-        </w:tc>
-        <w:tc>
-          <w:tcPr>
-            <w:tcW w:type="dxa" w:w="1800"/>
-            <w:tcMar>
-              <w:top w:type="dxa" w:w="40"/>
-              <w:left w:type="dxa" w:w="90"/>
-              <w:bottom w:type="dxa" w:w="40"/>
-              <w:right w:type="dxa" w:w="90"/>
-            </w:tcMar>
-          </w:tcPr>
-          <w:p>
-            <w:pPr>
-              <w:spacing w:after="20" w:before="20" w:line="252"/>
-            </w:pPr>
-            <w:r>
-              <w:rPr>
-                <w:b w:val="false"/>
-                <w:bCs w:val="false"/>
-                <w:color w:val="000000"/>
-                <w:sz w:val="19"/>
-                <w:szCs w:val="19"/>
-              </w:rPr>
-              <w:t xml:space="preserve">Texto/Data</w:t>
-            </w:r>
-          </w:p>
-        </w:tc>
-        <w:tc>
-          <w:tcPr>
-            <w:tcW w:type="dxa" w:w="4620"/>
-            <w:tcMar>
-              <w:top w:type="dxa" w:w="40"/>
-              <w:left w:type="dxa" w:w="90"/>
-              <w:bottom w:type="dxa" w:w="40"/>
-              <w:right w:type="dxa" w:w="90"/>
-            </w:tcMar>
-          </w:tcPr>
-          <w:p>
-            <w:pPr>
-              <w:spacing w:after="20" w:before="20" w:line="252"/>
-            </w:pPr>
-            <w:r>
-              <w:rPr>
-                <w:b w:val="false"/>
-                <w:bCs w:val="false"/>
-                <w:color w:val="000000"/>
-                <w:sz w:val="19"/>
-                <w:szCs w:val="19"/>
-              </w:rPr>
-              <w:t xml:space="preserve">Alerta de validade vencida.</w:t>
-            </w:r>
-          </w:p>
-        </w:tc>
-      </w:tr>
-      <w:tr>
-        <w:tc>
-          <w:tcPr>
-            <w:tcW w:type="dxa" w:w="2600"/>
-            <w:shd w:fill="F2F6FC" w:color="auto" w:val="clear"/>
-            <w:tcMar>
-              <w:top w:type="dxa" w:w="40"/>
-              <w:left w:type="dxa" w:w="90"/>
-              <w:bottom w:type="dxa" w:w="40"/>
-              <w:right w:type="dxa" w:w="90"/>
-            </w:tcMar>
-          </w:tcPr>
-          <w:p>
-            <w:pPr>
-              <w:spacing w:after="20" w:before="20" w:line="252"/>
-            </w:pPr>
-            <w:r>
-              <w:rPr>
-                <w:b w:val="false"/>
-                <w:bCs w:val="false"/>
-                <w:color w:val="000000"/>
-                <w:sz w:val="19"/>
-                <w:szCs w:val="19"/>
-              </w:rPr>
-              <w:t xml:space="preserve">Situação</w:t>
-            </w:r>
-          </w:p>
-        </w:tc>
-        <w:tc>
-          <w:tcPr>
-            <w:tcW w:type="dxa" w:w="1800"/>
-            <w:shd w:fill="F2F6FC" w:color="auto" w:val="clear"/>
-            <w:tcMar>
-              <w:top w:type="dxa" w:w="40"/>
-              <w:left w:type="dxa" w:w="90"/>
-              <w:bottom w:type="dxa" w:w="40"/>
-              <w:right w:type="dxa" w:w="90"/>
-            </w:tcMar>
-          </w:tcPr>
-          <w:p>
-            <w:pPr>
-              <w:spacing w:after="20" w:before="20" w:line="252"/>
-            </w:pPr>
-            <w:r>
-              <w:rPr>
-                <w:b w:val="false"/>
-                <w:bCs w:val="false"/>
-                <w:color w:val="000000"/>
-                <w:sz w:val="19"/>
-                <w:szCs w:val="19"/>
-              </w:rPr>
-              <w:t xml:space="preserve">Lista</w:t>
-            </w:r>
-          </w:p>
-        </w:tc>
-        <w:tc>
-          <w:tcPr>
-            <w:tcW w:type="dxa" w:w="4620"/>
-            <w:shd w:fill="F2F6FC" w:color="auto" w:val="clear"/>
-            <w:tcMar>
-              <w:top w:type="dxa" w:w="40"/>
-              <w:left w:type="dxa" w:w="90"/>
-              <w:bottom w:type="dxa" w:w="40"/>
-              <w:right w:type="dxa" w:w="90"/>
-            </w:tcMar>
-          </w:tcPr>
-          <w:p>
-            <w:pPr>
-              <w:spacing w:after="20" w:before="20" w:line="252"/>
-            </w:pPr>
-            <w:r>
-              <w:rPr>
-                <w:b w:val="false"/>
-                <w:bCs w:val="false"/>
-                <w:color w:val="000000"/>
-                <w:sz w:val="19"/>
-                <w:szCs w:val="19"/>
-              </w:rPr>
-              <w:t xml:space="preserve">Ativo / Inativo.</w:t>
-            </w:r>
-          </w:p>
-        </w:tc>
-      </w:tr>
-    </w:tbl>
-    <w:p>
-      <w:pPr>
-        <w:pStyle w:val="Heading2"/>
-        <w:spacing w:after="100" w:before="240"/>
-      </w:pPr>
-      <w:r>
-        <w:rPr>
-          <w:b/>
-          <w:bCs/>
-          <w:color w:val="2E74B5"/>
-          <w:sz w:val="25"/>
-          <w:szCs w:val="25"/>
-        </w:rPr>
-        <w:t xml:space="preserve">7.5. Entidade: Viagem</w:t>
+        <w:t xml:space="preserve">7.4. Entidade: Agendamento</w:t>
       </w:r>
     </w:p>
     <w:p>
@@ -6272,628 +5681,7 @@
           <w:sz w:val="21"/>
           <w:szCs w:val="21"/>
         </w:rPr>
-        <w:t xml:space="preserve">Representa a folha da van: um veículo, um motorista, um destino e uma data, com capacidade definida pela lotação do veículo.</w:t>
-      </w:r>
-    </w:p>
-    <w:tbl>
-      <w:tblPr>
-        <w:tblW w:type="dxa" w:w="9020"/>
-        <w:tblBorders>
-          <w:top w:val="single" w:color="BFBFBF" w:sz="2"/>
-          <w:left w:val="single" w:color="BFBFBF" w:sz="2"/>
-          <w:bottom w:val="single" w:color="BFBFBF" w:sz="2"/>
-          <w:right w:val="single" w:color="BFBFBF" w:sz="2"/>
-          <w:insideH w:val="single" w:color="D9D9D9" w:sz="2"/>
-          <w:insideV w:val="single" w:color="D9D9D9" w:sz="2"/>
-        </w:tblBorders>
-      </w:tblPr>
-      <w:tblGrid>
-        <w:gridCol w:w="2600"/>
-        <w:gridCol w:w="1500"/>
-        <w:gridCol w:w="4920"/>
-      </w:tblGrid>
-      <w:tr>
-        <w:trPr>
-          <w:tblHeader/>
-        </w:trPr>
-        <w:tc>
-          <w:tcPr>
-            <w:tcW w:type="dxa" w:w="2600"/>
-            <w:shd w:fill="2E74B5" w:color="auto" w:val="clear"/>
-            <w:tcMar>
-              <w:top w:type="dxa" w:w="40"/>
-              <w:left w:type="dxa" w:w="90"/>
-              <w:bottom w:type="dxa" w:w="40"/>
-              <w:right w:type="dxa" w:w="90"/>
-            </w:tcMar>
-          </w:tcPr>
-          <w:p>
-            <w:pPr>
-              <w:spacing w:after="20" w:before="20" w:line="252"/>
-            </w:pPr>
-            <w:r>
-              <w:rPr>
-                <w:b/>
-                <w:bCs/>
-                <w:color w:val="FFFFFF"/>
-                <w:sz w:val="19"/>
-                <w:szCs w:val="19"/>
-              </w:rPr>
-              <w:t xml:space="preserve">Campo</w:t>
-            </w:r>
-          </w:p>
-        </w:tc>
-        <w:tc>
-          <w:tcPr>
-            <w:tcW w:type="dxa" w:w="1500"/>
-            <w:shd w:fill="2E74B5" w:color="auto" w:val="clear"/>
-            <w:tcMar>
-              <w:top w:type="dxa" w:w="40"/>
-              <w:left w:type="dxa" w:w="90"/>
-              <w:bottom w:type="dxa" w:w="40"/>
-              <w:right w:type="dxa" w:w="90"/>
-            </w:tcMar>
-          </w:tcPr>
-          <w:p>
-            <w:pPr>
-              <w:spacing w:after="20" w:before="20" w:line="252"/>
-            </w:pPr>
-            <w:r>
-              <w:rPr>
-                <w:b/>
-                <w:bCs/>
-                <w:color w:val="FFFFFF"/>
-                <w:sz w:val="19"/>
-                <w:szCs w:val="19"/>
-              </w:rPr>
-              <w:t xml:space="preserve">Tipo</w:t>
-            </w:r>
-          </w:p>
-        </w:tc>
-        <w:tc>
-          <w:tcPr>
-            <w:tcW w:type="dxa" w:w="4920"/>
-            <w:shd w:fill="2E74B5" w:color="auto" w:val="clear"/>
-            <w:tcMar>
-              <w:top w:type="dxa" w:w="40"/>
-              <w:left w:type="dxa" w:w="90"/>
-              <w:bottom w:type="dxa" w:w="40"/>
-              <w:right w:type="dxa" w:w="90"/>
-            </w:tcMar>
-          </w:tcPr>
-          <w:p>
-            <w:pPr>
-              <w:spacing w:after="20" w:before="20" w:line="252"/>
-            </w:pPr>
-            <w:r>
-              <w:rPr>
-                <w:b/>
-                <w:bCs/>
-                <w:color w:val="FFFFFF"/>
-                <w:sz w:val="19"/>
-                <w:szCs w:val="19"/>
-              </w:rPr>
-              <w:t xml:space="preserve">Observação</w:t>
-            </w:r>
-          </w:p>
-        </w:tc>
-      </w:tr>
-      <w:tr>
-        <w:tc>
-          <w:tcPr>
-            <w:tcW w:type="dxa" w:w="2600"/>
-            <w:tcMar>
-              <w:top w:type="dxa" w:w="40"/>
-              <w:left w:type="dxa" w:w="90"/>
-              <w:bottom w:type="dxa" w:w="40"/>
-              <w:right w:type="dxa" w:w="90"/>
-            </w:tcMar>
-          </w:tcPr>
-          <w:p>
-            <w:pPr>
-              <w:spacing w:after="20" w:before="20" w:line="252"/>
-            </w:pPr>
-            <w:r>
-              <w:rPr>
-                <w:b w:val="false"/>
-                <w:bCs w:val="false"/>
-                <w:color w:val="000000"/>
-                <w:sz w:val="19"/>
-                <w:szCs w:val="19"/>
-              </w:rPr>
-              <w:t xml:space="preserve">Data</w:t>
-            </w:r>
-          </w:p>
-        </w:tc>
-        <w:tc>
-          <w:tcPr>
-            <w:tcW w:type="dxa" w:w="1500"/>
-            <w:tcMar>
-              <w:top w:type="dxa" w:w="40"/>
-              <w:left w:type="dxa" w:w="90"/>
-              <w:bottom w:type="dxa" w:w="40"/>
-              <w:right w:type="dxa" w:w="90"/>
-            </w:tcMar>
-          </w:tcPr>
-          <w:p>
-            <w:pPr>
-              <w:spacing w:after="20" w:before="20" w:line="252"/>
-            </w:pPr>
-            <w:r>
-              <w:rPr>
-                <w:b w:val="false"/>
-                <w:bCs w:val="false"/>
-                <w:color w:val="000000"/>
-                <w:sz w:val="19"/>
-                <w:szCs w:val="19"/>
-              </w:rPr>
-              <w:t xml:space="preserve">Data</w:t>
-            </w:r>
-          </w:p>
-        </w:tc>
-        <w:tc>
-          <w:tcPr>
-            <w:tcW w:type="dxa" w:w="4920"/>
-            <w:tcMar>
-              <w:top w:type="dxa" w:w="40"/>
-              <w:left w:type="dxa" w:w="90"/>
-              <w:bottom w:type="dxa" w:w="40"/>
-              <w:right w:type="dxa" w:w="90"/>
-            </w:tcMar>
-          </w:tcPr>
-          <w:p>
-            <w:pPr>
-              <w:spacing w:after="20" w:before="20" w:line="252"/>
-            </w:pPr>
-            <w:r>
-              <w:rPr>
-                <w:b w:val="false"/>
-                <w:bCs w:val="false"/>
-                <w:color w:val="000000"/>
-                <w:sz w:val="19"/>
-                <w:szCs w:val="19"/>
-              </w:rPr>
-              <w:t xml:space="preserve"/>
-            </w:r>
-          </w:p>
-        </w:tc>
-      </w:tr>
-      <w:tr>
-        <w:tc>
-          <w:tcPr>
-            <w:tcW w:type="dxa" w:w="2600"/>
-            <w:shd w:fill="F2F6FC" w:color="auto" w:val="clear"/>
-            <w:tcMar>
-              <w:top w:type="dxa" w:w="40"/>
-              <w:left w:type="dxa" w:w="90"/>
-              <w:bottom w:type="dxa" w:w="40"/>
-              <w:right w:type="dxa" w:w="90"/>
-            </w:tcMar>
-          </w:tcPr>
-          <w:p>
-            <w:pPr>
-              <w:spacing w:after="20" w:before="20" w:line="252"/>
-            </w:pPr>
-            <w:r>
-              <w:rPr>
-                <w:b w:val="false"/>
-                <w:bCs w:val="false"/>
-                <w:color w:val="000000"/>
-                <w:sz w:val="19"/>
-                <w:szCs w:val="19"/>
-              </w:rPr>
-              <w:t xml:space="preserve">Veículo</w:t>
-            </w:r>
-          </w:p>
-        </w:tc>
-        <w:tc>
-          <w:tcPr>
-            <w:tcW w:type="dxa" w:w="1500"/>
-            <w:shd w:fill="F2F6FC" w:color="auto" w:val="clear"/>
-            <w:tcMar>
-              <w:top w:type="dxa" w:w="40"/>
-              <w:left w:type="dxa" w:w="90"/>
-              <w:bottom w:type="dxa" w:w="40"/>
-              <w:right w:type="dxa" w:w="90"/>
-            </w:tcMar>
-          </w:tcPr>
-          <w:p>
-            <w:pPr>
-              <w:spacing w:after="20" w:before="20" w:line="252"/>
-            </w:pPr>
-            <w:r>
-              <w:rPr>
-                <w:b w:val="false"/>
-                <w:bCs w:val="false"/>
-                <w:color w:val="000000"/>
-                <w:sz w:val="19"/>
-                <w:szCs w:val="19"/>
-              </w:rPr>
-              <w:t xml:space="preserve">FK</w:t>
-            </w:r>
-          </w:p>
-        </w:tc>
-        <w:tc>
-          <w:tcPr>
-            <w:tcW w:type="dxa" w:w="4920"/>
-            <w:shd w:fill="F2F6FC" w:color="auto" w:val="clear"/>
-            <w:tcMar>
-              <w:top w:type="dxa" w:w="40"/>
-              <w:left w:type="dxa" w:w="90"/>
-              <w:bottom w:type="dxa" w:w="40"/>
-              <w:right w:type="dxa" w:w="90"/>
-            </w:tcMar>
-          </w:tcPr>
-          <w:p>
-            <w:pPr>
-              <w:spacing w:after="20" w:before="20" w:line="252"/>
-            </w:pPr>
-            <w:r>
-              <w:rPr>
-                <w:b w:val="false"/>
-                <w:bCs w:val="false"/>
-                <w:color w:val="000000"/>
-                <w:sz w:val="19"/>
-                <w:szCs w:val="19"/>
-              </w:rPr>
-              <w:t xml:space="preserve">Define a capacidade.</w:t>
-            </w:r>
-          </w:p>
-        </w:tc>
-      </w:tr>
-      <w:tr>
-        <w:tc>
-          <w:tcPr>
-            <w:tcW w:type="dxa" w:w="2600"/>
-            <w:tcMar>
-              <w:top w:type="dxa" w:w="40"/>
-              <w:left w:type="dxa" w:w="90"/>
-              <w:bottom w:type="dxa" w:w="40"/>
-              <w:right w:type="dxa" w:w="90"/>
-            </w:tcMar>
-          </w:tcPr>
-          <w:p>
-            <w:pPr>
-              <w:spacing w:after="20" w:before="20" w:line="252"/>
-            </w:pPr>
-            <w:r>
-              <w:rPr>
-                <w:b w:val="false"/>
-                <w:bCs w:val="false"/>
-                <w:color w:val="000000"/>
-                <w:sz w:val="19"/>
-                <w:szCs w:val="19"/>
-              </w:rPr>
-              <w:t xml:space="preserve">Motorista</w:t>
-            </w:r>
-          </w:p>
-        </w:tc>
-        <w:tc>
-          <w:tcPr>
-            <w:tcW w:type="dxa" w:w="1500"/>
-            <w:tcMar>
-              <w:top w:type="dxa" w:w="40"/>
-              <w:left w:type="dxa" w:w="90"/>
-              <w:bottom w:type="dxa" w:w="40"/>
-              <w:right w:type="dxa" w:w="90"/>
-            </w:tcMar>
-          </w:tcPr>
-          <w:p>
-            <w:pPr>
-              <w:spacing w:after="20" w:before="20" w:line="252"/>
-            </w:pPr>
-            <w:r>
-              <w:rPr>
-                <w:b w:val="false"/>
-                <w:bCs w:val="false"/>
-                <w:color w:val="000000"/>
-                <w:sz w:val="19"/>
-                <w:szCs w:val="19"/>
-              </w:rPr>
-              <w:t xml:space="preserve">FK</w:t>
-            </w:r>
-          </w:p>
-        </w:tc>
-        <w:tc>
-          <w:tcPr>
-            <w:tcW w:type="dxa" w:w="4920"/>
-            <w:tcMar>
-              <w:top w:type="dxa" w:w="40"/>
-              <w:left w:type="dxa" w:w="90"/>
-              <w:bottom w:type="dxa" w:w="40"/>
-              <w:right w:type="dxa" w:w="90"/>
-            </w:tcMar>
-          </w:tcPr>
-          <w:p>
-            <w:pPr>
-              <w:spacing w:after="20" w:before="20" w:line="252"/>
-            </w:pPr>
-            <w:r>
-              <w:rPr>
-                <w:b w:val="false"/>
-                <w:bCs w:val="false"/>
-                <w:color w:val="000000"/>
-                <w:sz w:val="19"/>
-                <w:szCs w:val="19"/>
-              </w:rPr>
-              <w:t xml:space="preserve"/>
-            </w:r>
-          </w:p>
-        </w:tc>
-      </w:tr>
-      <w:tr>
-        <w:tc>
-          <w:tcPr>
-            <w:tcW w:type="dxa" w:w="2600"/>
-            <w:shd w:fill="F2F6FC" w:color="auto" w:val="clear"/>
-            <w:tcMar>
-              <w:top w:type="dxa" w:w="40"/>
-              <w:left w:type="dxa" w:w="90"/>
-              <w:bottom w:type="dxa" w:w="40"/>
-              <w:right w:type="dxa" w:w="90"/>
-            </w:tcMar>
-          </w:tcPr>
-          <w:p>
-            <w:pPr>
-              <w:spacing w:after="20" w:before="20" w:line="252"/>
-            </w:pPr>
-            <w:r>
-              <w:rPr>
-                <w:b w:val="false"/>
-                <w:bCs w:val="false"/>
-                <w:color w:val="000000"/>
-                <w:sz w:val="19"/>
-                <w:szCs w:val="19"/>
-              </w:rPr>
-              <w:t xml:space="preserve">Destino</w:t>
-            </w:r>
-          </w:p>
-        </w:tc>
-        <w:tc>
-          <w:tcPr>
-            <w:tcW w:type="dxa" w:w="1500"/>
-            <w:shd w:fill="F2F6FC" w:color="auto" w:val="clear"/>
-            <w:tcMar>
-              <w:top w:type="dxa" w:w="40"/>
-              <w:left w:type="dxa" w:w="90"/>
-              <w:bottom w:type="dxa" w:w="40"/>
-              <w:right w:type="dxa" w:w="90"/>
-            </w:tcMar>
-          </w:tcPr>
-          <w:p>
-            <w:pPr>
-              <w:spacing w:after="20" w:before="20" w:line="252"/>
-            </w:pPr>
-            <w:r>
-              <w:rPr>
-                <w:b w:val="false"/>
-                <w:bCs w:val="false"/>
-                <w:color w:val="000000"/>
-                <w:sz w:val="19"/>
-                <w:szCs w:val="19"/>
-              </w:rPr>
-              <w:t xml:space="preserve">FK</w:t>
-            </w:r>
-          </w:p>
-        </w:tc>
-        <w:tc>
-          <w:tcPr>
-            <w:tcW w:type="dxa" w:w="4920"/>
-            <w:shd w:fill="F2F6FC" w:color="auto" w:val="clear"/>
-            <w:tcMar>
-              <w:top w:type="dxa" w:w="40"/>
-              <w:left w:type="dxa" w:w="90"/>
-              <w:bottom w:type="dxa" w:w="40"/>
-              <w:right w:type="dxa" w:w="90"/>
-            </w:tcMar>
-          </w:tcPr>
-          <w:p>
-            <w:pPr>
-              <w:spacing w:after="20" w:before="20" w:line="252"/>
-            </w:pPr>
-            <w:r>
-              <w:rPr>
-                <w:b w:val="false"/>
-                <w:bCs w:val="false"/>
-                <w:color w:val="000000"/>
-                <w:sz w:val="19"/>
-                <w:szCs w:val="19"/>
-              </w:rPr>
-              <w:t xml:space="preserve">Município/estabelecimento.</w:t>
-            </w:r>
-          </w:p>
-        </w:tc>
-      </w:tr>
-      <w:tr>
-        <w:tc>
-          <w:tcPr>
-            <w:tcW w:type="dxa" w:w="2600"/>
-            <w:tcMar>
-              <w:top w:type="dxa" w:w="40"/>
-              <w:left w:type="dxa" w:w="90"/>
-              <w:bottom w:type="dxa" w:w="40"/>
-              <w:right w:type="dxa" w:w="90"/>
-            </w:tcMar>
-          </w:tcPr>
-          <w:p>
-            <w:pPr>
-              <w:spacing w:after="20" w:before="20" w:line="252"/>
-            </w:pPr>
-            <w:r>
-              <w:rPr>
-                <w:b w:val="false"/>
-                <w:bCs w:val="false"/>
-                <w:color w:val="000000"/>
-                <w:sz w:val="19"/>
-                <w:szCs w:val="19"/>
-              </w:rPr>
-              <w:t xml:space="preserve">Capacidade / Ocupação</w:t>
-            </w:r>
-          </w:p>
-        </w:tc>
-        <w:tc>
-          <w:tcPr>
-            <w:tcW w:type="dxa" w:w="1500"/>
-            <w:tcMar>
-              <w:top w:type="dxa" w:w="40"/>
-              <w:left w:type="dxa" w:w="90"/>
-              <w:bottom w:type="dxa" w:w="40"/>
-              <w:right w:type="dxa" w:w="90"/>
-            </w:tcMar>
-          </w:tcPr>
-          <w:p>
-            <w:pPr>
-              <w:spacing w:after="20" w:before="20" w:line="252"/>
-            </w:pPr>
-            <w:r>
-              <w:rPr>
-                <w:b w:val="false"/>
-                <w:bCs w:val="false"/>
-                <w:color w:val="000000"/>
-                <w:sz w:val="19"/>
-                <w:szCs w:val="19"/>
-              </w:rPr>
-              <w:t xml:space="preserve">Inteiro</w:t>
-            </w:r>
-          </w:p>
-        </w:tc>
-        <w:tc>
-          <w:tcPr>
-            <w:tcW w:type="dxa" w:w="4920"/>
-            <w:tcMar>
-              <w:top w:type="dxa" w:w="40"/>
-              <w:left w:type="dxa" w:w="90"/>
-              <w:bottom w:type="dxa" w:w="40"/>
-              <w:right w:type="dxa" w:w="90"/>
-            </w:tcMar>
-          </w:tcPr>
-          <w:p>
-            <w:pPr>
-              <w:spacing w:after="20" w:before="20" w:line="252"/>
-            </w:pPr>
-            <w:r>
-              <w:rPr>
-                <w:b w:val="false"/>
-                <w:bCs w:val="false"/>
-                <w:color w:val="000000"/>
-                <w:sz w:val="19"/>
-                <w:szCs w:val="19"/>
-              </w:rPr>
-              <w:t xml:space="preserve">Ocupação calculada a partir dos agendamentos.</w:t>
-            </w:r>
-          </w:p>
-        </w:tc>
-      </w:tr>
-      <w:tr>
-        <w:tc>
-          <w:tcPr>
-            <w:tcW w:type="dxa" w:w="2600"/>
-            <w:shd w:fill="F2F6FC" w:color="auto" w:val="clear"/>
-            <w:tcMar>
-              <w:top w:type="dxa" w:w="40"/>
-              <w:left w:type="dxa" w:w="90"/>
-              <w:bottom w:type="dxa" w:w="40"/>
-              <w:right w:type="dxa" w:w="90"/>
-            </w:tcMar>
-          </w:tcPr>
-          <w:p>
-            <w:pPr>
-              <w:spacing w:after="20" w:before="20" w:line="252"/>
-            </w:pPr>
-            <w:r>
-              <w:rPr>
-                <w:b w:val="false"/>
-                <w:bCs w:val="false"/>
-                <w:color w:val="000000"/>
-                <w:sz w:val="19"/>
-                <w:szCs w:val="19"/>
-              </w:rPr>
-              <w:t xml:space="preserve">Situação</w:t>
-            </w:r>
-          </w:p>
-        </w:tc>
-        <w:tc>
-          <w:tcPr>
-            <w:tcW w:type="dxa" w:w="1500"/>
-            <w:shd w:fill="F2F6FC" w:color="auto" w:val="clear"/>
-            <w:tcMar>
-              <w:top w:type="dxa" w:w="40"/>
-              <w:left w:type="dxa" w:w="90"/>
-              <w:bottom w:type="dxa" w:w="40"/>
-              <w:right w:type="dxa" w:w="90"/>
-            </w:tcMar>
-          </w:tcPr>
-          <w:p>
-            <w:pPr>
-              <w:spacing w:after="20" w:before="20" w:line="252"/>
-            </w:pPr>
-            <w:r>
-              <w:rPr>
-                <w:b w:val="false"/>
-                <w:bCs w:val="false"/>
-                <w:color w:val="000000"/>
-                <w:sz w:val="19"/>
-                <w:szCs w:val="19"/>
-              </w:rPr>
-              <w:t xml:space="preserve">Lista</w:t>
-            </w:r>
-          </w:p>
-        </w:tc>
-        <w:tc>
-          <w:tcPr>
-            <w:tcW w:type="dxa" w:w="4920"/>
-            <w:shd w:fill="F2F6FC" w:color="auto" w:val="clear"/>
-            <w:tcMar>
-              <w:top w:type="dxa" w:w="40"/>
-              <w:left w:type="dxa" w:w="90"/>
-              <w:bottom w:type="dxa" w:w="40"/>
-              <w:right w:type="dxa" w:w="90"/>
-            </w:tcMar>
-          </w:tcPr>
-          <w:p>
-            <w:pPr>
-              <w:spacing w:after="20" w:before="20" w:line="252"/>
-            </w:pPr>
-            <w:r>
-              <w:rPr>
-                <w:b w:val="false"/>
-                <w:bCs w:val="false"/>
-                <w:color w:val="000000"/>
-                <w:sz w:val="19"/>
-                <w:szCs w:val="19"/>
-              </w:rPr>
-              <w:t xml:space="preserve">Programada, Em viagem, Finalizada, Cancelada.</w:t>
-            </w:r>
-          </w:p>
-        </w:tc>
-      </w:tr>
-    </w:tbl>
-    <w:p>
-      <w:pPr>
-        <w:pStyle w:val="Heading2"/>
-        <w:spacing w:after="100" w:before="240"/>
-      </w:pPr>
-      <w:r>
-        <w:rPr>
-          <w:b/>
-          <w:bCs/>
-          <w:color w:val="2E74B5"/>
-          <w:sz w:val="25"/>
-          <w:szCs w:val="25"/>
-        </w:rPr>
-        <w:t xml:space="preserve">7.6. Entidade: Agendamento</w:t>
-      </w:r>
-    </w:p>
-    <w:p>
-      <w:pPr>
-        <w:spacing w:after="120" w:line="276"/>
-      </w:pPr>
-      <w:r>
-        <w:rPr>
-          <w:sz w:val="21"/>
-          <w:szCs w:val="21"/>
-        </w:rPr>
-        <w:t xml:space="preserve">A marcação individual — equivalente à ficha de Marcação de Transportes. Ocupa um lugar (ou dois, com acompanhante) na viagem.</w:t>
+        <w:t xml:space="preserve">A marcação individual — equivalente à ficha de Marcação de Transportes. Ocupa um horário na agenda do dia.</w:t>
       </w:r>
     </w:p>
     <w:tbl>
@@ -7157,7 +5945,7 @@
                 <w:sz w:val="19"/>
                 <w:szCs w:val="19"/>
               </w:rPr>
-              <w:t xml:space="preserve">Ocupação de vaga(s).</w:t>
+              <w:t xml:space="preserve">Quem será transportado.</w:t>
             </w:r>
           </w:p>
         </w:tc>
@@ -7185,7 +5973,7 @@
                 <w:sz w:val="19"/>
                 <w:szCs w:val="19"/>
               </w:rPr>
-              <w:t xml:space="preserve">Viagem</w:t>
+              <w:t xml:space="preserve">Data</w:t>
             </w:r>
           </w:p>
         </w:tc>
@@ -7211,7 +5999,7 @@
                 <w:sz w:val="19"/>
                 <w:szCs w:val="19"/>
               </w:rPr>
-              <w:t xml:space="preserve">FK</w:t>
+              <w:t xml:space="preserve">Data</w:t>
             </w:r>
           </w:p>
         </w:tc>
@@ -7237,7 +6025,7 @@
                 <w:sz w:val="19"/>
                 <w:szCs w:val="19"/>
               </w:rPr>
-              <w:t xml:space="preserve">Vincula veículo/motorista/destino/data.</w:t>
+              <w:t xml:space="preserve">Dia útil (seg–sex).</w:t>
             </w:r>
           </w:p>
         </w:tc>
@@ -7266,7 +6054,7 @@
                 <w:sz w:val="19"/>
                 <w:szCs w:val="19"/>
               </w:rPr>
-              <w:t xml:space="preserve">Hora / Local de embarque</w:t>
+              <w:t xml:space="preserve">Horário</w:t>
             </w:r>
           </w:p>
         </w:tc>
@@ -7293,7 +6081,7 @@
                 <w:sz w:val="19"/>
                 <w:szCs w:val="19"/>
               </w:rPr>
-              <w:t xml:space="preserve">Hora/Texto</w:t>
+              <w:t xml:space="preserve">Hora</w:t>
             </w:r>
           </w:p>
         </w:tc>
@@ -7320,7 +6108,7 @@
                 <w:sz w:val="19"/>
                 <w:szCs w:val="19"/>
               </w:rPr>
-              <w:t xml:space="preserve">Mapa de viagem e cartão.</w:t>
+              <w:t xml:space="preserve">Dentro da janela 06:00–16:30.</w:t>
             </w:r>
           </w:p>
         </w:tc>
@@ -7348,7 +6136,7 @@
                 <w:sz w:val="19"/>
                 <w:szCs w:val="19"/>
               </w:rPr>
-              <w:t xml:space="preserve">Local da consulta</w:t>
+              <w:t xml:space="preserve">Destino</w:t>
             </w:r>
           </w:p>
         </w:tc>
@@ -7374,7 +6162,7 @@
                 <w:sz w:val="19"/>
                 <w:szCs w:val="19"/>
               </w:rPr>
-              <w:t xml:space="preserve">Texto</w:t>
+              <w:t xml:space="preserve">FK</w:t>
             </w:r>
           </w:p>
         </w:tc>
@@ -7400,7 +6188,7 @@
                 <w:sz w:val="19"/>
                 <w:szCs w:val="19"/>
               </w:rPr>
-              <w:t xml:space="preserve">Cartão de embarque.</w:t>
+              <w:t xml:space="preserve">Município / estabelecimento de destino.</w:t>
             </w:r>
           </w:p>
         </w:tc>
@@ -7429,7 +6217,7 @@
                 <w:sz w:val="19"/>
                 <w:szCs w:val="19"/>
               </w:rPr>
-              <w:t xml:space="preserve">Procedimento (SIGTAP)</w:t>
+              <w:t xml:space="preserve">Local de embarque</w:t>
             </w:r>
           </w:p>
         </w:tc>
@@ -7456,7 +6244,7 @@
                 <w:sz w:val="19"/>
                 <w:szCs w:val="19"/>
               </w:rPr>
-              <w:t xml:space="preserve">Código/Texto</w:t>
+              <w:t xml:space="preserve">Texto</w:t>
             </w:r>
           </w:p>
         </w:tc>
@@ -7483,7 +6271,7 @@
                 <w:sz w:val="19"/>
                 <w:szCs w:val="19"/>
               </w:rPr>
-              <w:t xml:space="preserve">BPA (código livre no MVP).</w:t>
+              <w:t xml:space="preserve">Lista do Dia e cartão.</w:t>
             </w:r>
           </w:p>
         </w:tc>
@@ -7511,7 +6299,7 @@
                 <w:sz w:val="19"/>
                 <w:szCs w:val="19"/>
               </w:rPr>
-              <w:t xml:space="preserve">CID / CBO / Caráter</w:t>
+              <w:t xml:space="preserve">Local da consulta</w:t>
             </w:r>
           </w:p>
         </w:tc>
@@ -7537,7 +6325,7 @@
                 <w:sz w:val="19"/>
                 <w:szCs w:val="19"/>
               </w:rPr>
-              <w:t xml:space="preserve">Código/Texto</w:t>
+              <w:t xml:space="preserve">Texto</w:t>
             </w:r>
           </w:p>
         </w:tc>
@@ -7563,7 +6351,7 @@
                 <w:sz w:val="19"/>
                 <w:szCs w:val="19"/>
               </w:rPr>
-              <w:t xml:space="preserve">BPA.</w:t>
+              <w:t xml:space="preserve">Cartão de embarque.</w:t>
             </w:r>
           </w:p>
         </w:tc>
@@ -7592,7 +6380,7 @@
                 <w:sz w:val="19"/>
                 <w:szCs w:val="19"/>
               </w:rPr>
-              <w:t xml:space="preserve">Status</w:t>
+              <w:t xml:space="preserve">Tipo de veículo</w:t>
             </w:r>
           </w:p>
         </w:tc>
@@ -7646,7 +6434,7 @@
                 <w:sz w:val="19"/>
                 <w:szCs w:val="19"/>
               </w:rPr>
-              <w:t xml:space="preserve">Agendado, Confirmado, Em viagem, Finalizado, Cancelado, Faltou.</w:t>
+              <w:t xml:space="preserve">Campo simples (van, ambulância, carro...); sem cadastro.</w:t>
             </w:r>
           </w:p>
         </w:tc>
@@ -7674,6 +6462,250 @@
                 <w:sz w:val="19"/>
                 <w:szCs w:val="19"/>
               </w:rPr>
+              <w:t xml:space="preserve">Procedimento (SIGTAP)</w:t>
+            </w:r>
+          </w:p>
+        </w:tc>
+        <w:tc>
+          <w:tcPr>
+            <w:tcW w:type="dxa" w:w="1700"/>
+            <w:tcMar>
+              <w:top w:type="dxa" w:w="40"/>
+              <w:left w:type="dxa" w:w="90"/>
+              <w:bottom w:type="dxa" w:w="40"/>
+              <w:right w:type="dxa" w:w="90"/>
+            </w:tcMar>
+          </w:tcPr>
+          <w:p>
+            <w:pPr>
+              <w:spacing w:after="20" w:before="20" w:line="252"/>
+            </w:pPr>
+            <w:r>
+              <w:rPr>
+                <w:b w:val="false"/>
+                <w:bCs w:val="false"/>
+                <w:color w:val="000000"/>
+                <w:sz w:val="19"/>
+                <w:szCs w:val="19"/>
+              </w:rPr>
+              <w:t xml:space="preserve">Código/Texto</w:t>
+            </w:r>
+          </w:p>
+        </w:tc>
+        <w:tc>
+          <w:tcPr>
+            <w:tcW w:type="dxa" w:w="4820"/>
+            <w:tcMar>
+              <w:top w:type="dxa" w:w="40"/>
+              <w:left w:type="dxa" w:w="90"/>
+              <w:bottom w:type="dxa" w:w="40"/>
+              <w:right w:type="dxa" w:w="90"/>
+            </w:tcMar>
+          </w:tcPr>
+          <w:p>
+            <w:pPr>
+              <w:spacing w:after="20" w:before="20" w:line="252"/>
+            </w:pPr>
+            <w:r>
+              <w:rPr>
+                <w:b w:val="false"/>
+                <w:bCs w:val="false"/>
+                <w:color w:val="000000"/>
+                <w:sz w:val="19"/>
+                <w:szCs w:val="19"/>
+              </w:rPr>
+              <w:t xml:space="preserve">BPA (código livre no MVP).</w:t>
+            </w:r>
+          </w:p>
+        </w:tc>
+      </w:tr>
+      <w:tr>
+        <w:tc>
+          <w:tcPr>
+            <w:tcW w:type="dxa" w:w="2500"/>
+            <w:shd w:fill="F2F6FC" w:color="auto" w:val="clear"/>
+            <w:tcMar>
+              <w:top w:type="dxa" w:w="40"/>
+              <w:left w:type="dxa" w:w="90"/>
+              <w:bottom w:type="dxa" w:w="40"/>
+              <w:right w:type="dxa" w:w="90"/>
+            </w:tcMar>
+          </w:tcPr>
+          <w:p>
+            <w:pPr>
+              <w:spacing w:after="20" w:before="20" w:line="252"/>
+            </w:pPr>
+            <w:r>
+              <w:rPr>
+                <w:b w:val="false"/>
+                <w:bCs w:val="false"/>
+                <w:color w:val="000000"/>
+                <w:sz w:val="19"/>
+                <w:szCs w:val="19"/>
+              </w:rPr>
+              <w:t xml:space="preserve">CID / CBO / Caráter</w:t>
+            </w:r>
+          </w:p>
+        </w:tc>
+        <w:tc>
+          <w:tcPr>
+            <w:tcW w:type="dxa" w:w="1700"/>
+            <w:shd w:fill="F2F6FC" w:color="auto" w:val="clear"/>
+            <w:tcMar>
+              <w:top w:type="dxa" w:w="40"/>
+              <w:left w:type="dxa" w:w="90"/>
+              <w:bottom w:type="dxa" w:w="40"/>
+              <w:right w:type="dxa" w:w="90"/>
+            </w:tcMar>
+          </w:tcPr>
+          <w:p>
+            <w:pPr>
+              <w:spacing w:after="20" w:before="20" w:line="252"/>
+            </w:pPr>
+            <w:r>
+              <w:rPr>
+                <w:b w:val="false"/>
+                <w:bCs w:val="false"/>
+                <w:color w:val="000000"/>
+                <w:sz w:val="19"/>
+                <w:szCs w:val="19"/>
+              </w:rPr>
+              <w:t xml:space="preserve">Código/Texto</w:t>
+            </w:r>
+          </w:p>
+        </w:tc>
+        <w:tc>
+          <w:tcPr>
+            <w:tcW w:type="dxa" w:w="4820"/>
+            <w:shd w:fill="F2F6FC" w:color="auto" w:val="clear"/>
+            <w:tcMar>
+              <w:top w:type="dxa" w:w="40"/>
+              <w:left w:type="dxa" w:w="90"/>
+              <w:bottom w:type="dxa" w:w="40"/>
+              <w:right w:type="dxa" w:w="90"/>
+            </w:tcMar>
+          </w:tcPr>
+          <w:p>
+            <w:pPr>
+              <w:spacing w:after="20" w:before="20" w:line="252"/>
+            </w:pPr>
+            <w:r>
+              <w:rPr>
+                <w:b w:val="false"/>
+                <w:bCs w:val="false"/>
+                <w:color w:val="000000"/>
+                <w:sz w:val="19"/>
+                <w:szCs w:val="19"/>
+              </w:rPr>
+              <w:t xml:space="preserve">BPA.</w:t>
+            </w:r>
+          </w:p>
+        </w:tc>
+      </w:tr>
+      <w:tr>
+        <w:tc>
+          <w:tcPr>
+            <w:tcW w:type="dxa" w:w="2500"/>
+            <w:tcMar>
+              <w:top w:type="dxa" w:w="40"/>
+              <w:left w:type="dxa" w:w="90"/>
+              <w:bottom w:type="dxa" w:w="40"/>
+              <w:right w:type="dxa" w:w="90"/>
+            </w:tcMar>
+          </w:tcPr>
+          <w:p>
+            <w:pPr>
+              <w:spacing w:after="20" w:before="20" w:line="252"/>
+            </w:pPr>
+            <w:r>
+              <w:rPr>
+                <w:b w:val="false"/>
+                <w:bCs w:val="false"/>
+                <w:color w:val="000000"/>
+                <w:sz w:val="19"/>
+                <w:szCs w:val="19"/>
+              </w:rPr>
+              <w:t xml:space="preserve">Status</w:t>
+            </w:r>
+          </w:p>
+        </w:tc>
+        <w:tc>
+          <w:tcPr>
+            <w:tcW w:type="dxa" w:w="1700"/>
+            <w:tcMar>
+              <w:top w:type="dxa" w:w="40"/>
+              <w:left w:type="dxa" w:w="90"/>
+              <w:bottom w:type="dxa" w:w="40"/>
+              <w:right w:type="dxa" w:w="90"/>
+            </w:tcMar>
+          </w:tcPr>
+          <w:p>
+            <w:pPr>
+              <w:spacing w:after="20" w:before="20" w:line="252"/>
+            </w:pPr>
+            <w:r>
+              <w:rPr>
+                <w:b w:val="false"/>
+                <w:bCs w:val="false"/>
+                <w:color w:val="000000"/>
+                <w:sz w:val="19"/>
+                <w:szCs w:val="19"/>
+              </w:rPr>
+              <w:t xml:space="preserve">Lista</w:t>
+            </w:r>
+          </w:p>
+        </w:tc>
+        <w:tc>
+          <w:tcPr>
+            <w:tcW w:type="dxa" w:w="4820"/>
+            <w:tcMar>
+              <w:top w:type="dxa" w:w="40"/>
+              <w:left w:type="dxa" w:w="90"/>
+              <w:bottom w:type="dxa" w:w="40"/>
+              <w:right w:type="dxa" w:w="90"/>
+            </w:tcMar>
+          </w:tcPr>
+          <w:p>
+            <w:pPr>
+              <w:spacing w:after="20" w:before="20" w:line="252"/>
+            </w:pPr>
+            <w:r>
+              <w:rPr>
+                <w:b w:val="false"/>
+                <w:bCs w:val="false"/>
+                <w:color w:val="000000"/>
+                <w:sz w:val="19"/>
+                <w:szCs w:val="19"/>
+              </w:rPr>
+              <w:t xml:space="preserve">Agendado, Confirmado, Em atendimento, Finalizado, Cancelado, Faltou.</w:t>
+            </w:r>
+          </w:p>
+        </w:tc>
+      </w:tr>
+      <w:tr>
+        <w:tc>
+          <w:tcPr>
+            <w:tcW w:type="dxa" w:w="2500"/>
+            <w:shd w:fill="F2F6FC" w:color="auto" w:val="clear"/>
+            <w:tcMar>
+              <w:top w:type="dxa" w:w="40"/>
+              <w:left w:type="dxa" w:w="90"/>
+              <w:bottom w:type="dxa" w:w="40"/>
+              <w:right w:type="dxa" w:w="90"/>
+            </w:tcMar>
+          </w:tcPr>
+          <w:p>
+            <w:pPr>
+              <w:spacing w:after="20" w:before="20" w:line="252"/>
+            </w:pPr>
+            <w:r>
+              <w:rPr>
+                <w:b w:val="false"/>
+                <w:bCs w:val="false"/>
+                <w:color w:val="000000"/>
+                <w:sz w:val="19"/>
+                <w:szCs w:val="19"/>
+              </w:rPr>
               <w:t xml:space="preserve">Observações</w:t>
             </w:r>
           </w:p>
@@ -7681,6 +6713,7 @@
         <w:tc>
           <w:tcPr>
             <w:tcW w:type="dxa" w:w="1700"/>
+            <w:shd w:fill="F2F6FC" w:color="auto" w:val="clear"/>
             <w:tcMar>
               <w:top w:type="dxa" w:w="40"/>
               <w:left w:type="dxa" w:w="90"/>
@@ -7707,6 +6740,7 @@
         <w:tc>
           <w:tcPr>
             <w:tcW w:type="dxa" w:w="4820"/>
+            <w:shd w:fill="F2F6FC" w:color="auto" w:val="clear"/>
             <w:tcMar>
               <w:top w:type="dxa" w:w="40"/>
               <w:left w:type="dxa" w:w="90"/>
@@ -7745,7 +6779,7 @@
           <w:sz w:val="25"/>
           <w:szCs w:val="25"/>
         </w:rPr>
-        <w:t xml:space="preserve">7.7. Demais entidades</w:t>
+        <w:t xml:space="preserve">7.5. Demais entidades</w:t>
       </w:r>
     </w:p>
     <w:tbl>
@@ -8057,7 +7091,7 @@
           <w:sz w:val="25"/>
           <w:szCs w:val="25"/>
         </w:rPr>
-        <w:t xml:space="preserve">7.8. Relacionamentos principais</w:t>
+        <w:t xml:space="preserve">7.6. Relacionamentos principais</w:t>
       </w:r>
     </w:p>
     <w:p>
@@ -8091,7 +7125,7 @@
           <w:sz w:val="21"/>
           <w:szCs w:val="21"/>
         </w:rPr>
-        <w:t xml:space="preserve">Uma Viagem agrega muitos Agendamentos, limitada pela lotação do Veículo (1:N com restrição de capacidade);</w:t>
+        <w:t xml:space="preserve">Cada Agendamento pertence a uma data e a um horário da agenda (06:00–16:30, seg–sex);</w:t>
       </w:r>
     </w:p>
     <w:p>
@@ -8108,7 +7142,7 @@
           <w:sz w:val="21"/>
           <w:szCs w:val="21"/>
         </w:rPr>
-        <w:t xml:space="preserve">Uma Viagem referencia um Veículo, um Motorista e um Destino (N:1 cada);</w:t>
+        <w:t xml:space="preserve">Um Agendamento referencia um Destino (N:1);</w:t>
       </w:r>
     </w:p>
     <w:p>
@@ -8158,7 +7192,7 @@
           <w:sz w:val="25"/>
           <w:szCs w:val="25"/>
         </w:rPr>
-        <w:t xml:space="preserve">7.9. Regras de negócio principais</w:t>
+        <w:t xml:space="preserve">7.7. Regras de negócio principais</w:t>
       </w:r>
     </w:p>
     <w:p>
@@ -8192,7 +7226,7 @@
           <w:sz w:val="21"/>
           <w:szCs w:val="21"/>
         </w:rPr>
-        <w:t xml:space="preserve">Controle de lotação: impedir agendamento quando a ocupação da viagem atingir a capacidade do veículo; excedentes vão para lista de espera.</w:t>
+        <w:t xml:space="preserve">Agenda: horários restritos à janela 06:00–16:30, apenas em dias úteis (segunda a sexta).</w:t>
       </w:r>
     </w:p>
     <w:p>
@@ -8209,7 +7243,7 @@
           <w:sz w:val="21"/>
           <w:szCs w:val="21"/>
         </w:rPr>
-        <w:t xml:space="preserve">Idade calculada automaticamente a partir da data de nascimento.</w:t>
+        <w:t xml:space="preserve">Ordenação: os agendamentos do dia são exibidos em ordem crescente de horário.</w:t>
       </w:r>
     </w:p>
     <w:p>
@@ -8226,7 +7260,7 @@
           <w:sz w:val="21"/>
           <w:szCs w:val="21"/>
         </w:rPr>
-        <w:t xml:space="preserve">Confirmação da viagem: registrar o contato telefônico realizado no dia anterior.</w:t>
+        <w:t xml:space="preserve">Capacidade por horário: parâmetro configurável; ao atingir o limite, o horário fica indisponível (excedentes vão para lista de espera).</w:t>
       </w:r>
     </w:p>
     <w:p>
@@ -8243,7 +7277,7 @@
           <w:sz w:val="21"/>
           <w:szCs w:val="21"/>
         </w:rPr>
-        <w:t xml:space="preserve">Senhas: emissão sequencial MT-01 a MT-50, reinício automático após a 50 e reinício diário.</w:t>
+        <w:t xml:space="preserve">Idade calculada automaticamente a partir da data de nascimento.</w:t>
       </w:r>
     </w:p>
     <w:p>
@@ -8260,6 +7294,40 @@
           <w:sz w:val="21"/>
           <w:szCs w:val="21"/>
         </w:rPr>
+        <w:t xml:space="preserve">Confirmação da viagem: registrar o contato telefônico realizado no dia anterior.</w:t>
+      </w:r>
+    </w:p>
+    <w:p>
+      <w:pPr>
+        <w:pStyle w:val="ListParagraph"/>
+        <w:numPr>
+          <w:ilvl w:val="0"/>
+          <w:numId w:val="3"/>
+        </w:numPr>
+        <w:spacing w:after="60" w:line="264"/>
+      </w:pPr>
+      <w:r>
+        <w:rPr>
+          <w:sz w:val="21"/>
+          <w:szCs w:val="21"/>
+        </w:rPr>
+        <w:t xml:space="preserve">Senhas: emissão sequencial MT-01 a MT-50, reinício automático após a 50 e reinício diário.</w:t>
+      </w:r>
+    </w:p>
+    <w:p>
+      <w:pPr>
+        <w:pStyle w:val="ListParagraph"/>
+        <w:numPr>
+          <w:ilvl w:val="0"/>
+          <w:numId w:val="3"/>
+        </w:numPr>
+        <w:spacing w:after="60" w:line="264"/>
+      </w:pPr>
+      <w:r>
+        <w:rPr>
+          <w:sz w:val="21"/>
+          <w:szCs w:val="21"/>
+        </w:rPr>
         <w:t xml:space="preserve">Auditoria: nenhuma operação de inclusão/alteração/exclusão sem registro; logs não editáveis por usuários comuns.</w:t>
       </w:r>
     </w:p>
@@ -8325,7 +7393,7 @@
           <w:sz w:val="25"/>
           <w:szCs w:val="25"/>
         </w:rPr>
-        <w:t xml:space="preserve">8.2. Mapa de Viagem</w:t>
+        <w:t xml:space="preserve">8.2. Lista do Dia</w:t>
       </w:r>
     </w:p>
     <w:p>
@@ -8337,7 +7405,7 @@
           <w:sz w:val="21"/>
           <w:szCs w:val="21"/>
         </w:rPr>
-        <w:t xml:space="preserve">Gerado por Viagem (veículo/destino/data), listando os passageiros numerados (até a lotação do veículo) com: Paciente/Acompanhante, Contato, Hora, Embarque, Local de destino, Idade e Documento. Destinado ao uso do motorista.</w:t>
+        <w:t xml:space="preserve">Gerada por data, listando os pacientes do dia em ordem de horário, com: Horário, Paciente/Acompanhante, Contato, Local de embarque, Destino, Idade e Documento. Substitui a antiga planilha da van e serve para conferência do embarque.</w:t>
       </w:r>
     </w:p>
     <w:p>
@@ -8365,7 +7433,7 @@
           <w:sz w:val="21"/>
           <w:szCs w:val="21"/>
         </w:rPr>
-        <w:t xml:space="preserve">Relatório filtrável (período, município, veículo, motorista, estabelecimento, procedimento) reunindo os campos necessários à digitação do BPA-I: Nome, CNS, sexo, nascimento, raça/cor, endereço, código IBGE, data do atendimento, procedimento, CID e caráter. Exportável em PDF e Excel. Contempla paciente e acompanhante como sequências distintas.</w:t>
+        <w:t xml:space="preserve">Relatório filtrável (período, dia, mês, município, estabelecimento, procedimento) reunindo os campos necessários à digitação do BPA-I: Nome, CNS, sexo, nascimento, raça/cor, endereço, código IBGE, data do atendimento, procedimento, CID e caráter. Exportável em PDF e Excel. Contempla paciente e acompanhante como sequências distintas.</w:t>
       </w:r>
     </w:p>
     <w:p>
@@ -8381,7 +7449,120 @@
           <w:sz w:val="25"/>
           <w:szCs w:val="25"/>
         </w:rPr>
-        <w:t xml:space="preserve">8.4. Painel de Senhas</w:t>
+        <w:t xml:space="preserve">8.4. Relatórios e Consultas</w:t>
+      </w:r>
+    </w:p>
+    <w:p>
+      <w:pPr>
+        <w:spacing w:after="120" w:line="276"/>
+      </w:pPr>
+      <w:r>
+        <w:rPr>
+          <w:sz w:val="21"/>
+          <w:szCs w:val="21"/>
+        </w:rPr>
+        <w:t xml:space="preserve">Além do BPA, o sistema oferece consultas e relatórios com múltiplos recortes, exportáveis em PDF e Excel:</w:t>
+      </w:r>
+    </w:p>
+    <w:p>
+      <w:pPr>
+        <w:pStyle w:val="ListParagraph"/>
+        <w:numPr>
+          <w:ilvl w:val="0"/>
+          <w:numId w:val="2"/>
+        </w:numPr>
+        <w:spacing w:after="60" w:line="264"/>
+      </w:pPr>
+      <w:r>
+        <w:rPr>
+          <w:sz w:val="21"/>
+          <w:szCs w:val="21"/>
+        </w:rPr>
+        <w:t xml:space="preserve">Por agendamento (registro individual);</w:t>
+      </w:r>
+    </w:p>
+    <w:p>
+      <w:pPr>
+        <w:pStyle w:val="ListParagraph"/>
+        <w:numPr>
+          <w:ilvl w:val="0"/>
+          <w:numId w:val="2"/>
+        </w:numPr>
+        <w:spacing w:after="60" w:line="264"/>
+      </w:pPr>
+      <w:r>
+        <w:rPr>
+          <w:sz w:val="21"/>
+          <w:szCs w:val="21"/>
+        </w:rPr>
+        <w:t xml:space="preserve">Por dia e por mês (produção do período);</w:t>
+      </w:r>
+    </w:p>
+    <w:p>
+      <w:pPr>
+        <w:pStyle w:val="ListParagraph"/>
+        <w:numPr>
+          <w:ilvl w:val="0"/>
+          <w:numId w:val="2"/>
+        </w:numPr>
+        <w:spacing w:after="60" w:line="264"/>
+      </w:pPr>
+      <w:r>
+        <w:rPr>
+          <w:sz w:val="21"/>
+          <w:szCs w:val="21"/>
+        </w:rPr>
+        <w:t xml:space="preserve">Por nome do paciente (histórico da pessoa);</w:t>
+      </w:r>
+    </w:p>
+    <w:p>
+      <w:pPr>
+        <w:pStyle w:val="ListParagraph"/>
+        <w:numPr>
+          <w:ilvl w:val="0"/>
+          <w:numId w:val="2"/>
+        </w:numPr>
+        <w:spacing w:after="60" w:line="264"/>
+      </w:pPr>
+      <w:r>
+        <w:rPr>
+          <w:sz w:val="21"/>
+          <w:szCs w:val="21"/>
+        </w:rPr>
+        <w:t xml:space="preserve">Por município e por estabelecimento de destino;</w:t>
+      </w:r>
+    </w:p>
+    <w:p>
+      <w:pPr>
+        <w:pStyle w:val="ListParagraph"/>
+        <w:numPr>
+          <w:ilvl w:val="0"/>
+          <w:numId w:val="2"/>
+        </w:numPr>
+        <w:spacing w:after="60" w:line="264"/>
+      </w:pPr>
+      <w:r>
+        <w:rPr>
+          <w:sz w:val="21"/>
+          <w:szCs w:val="21"/>
+        </w:rPr>
+        <w:t xml:space="preserve">Por procedimento e por status (ex.: faltas).</w:t>
+      </w:r>
+    </w:p>
+    <w:p>
+      <w:pPr>
+        <w:pStyle w:val="Heading2"/>
+        <w:spacing w:after="100" w:before="240"/>
+      </w:pPr>
+      <w:r>
+        <w:rPr>
+          <w:b/>
+          <w:bCs/>
+          <w:color w:val="2E74B5"/>
+          <w:sz w:val="25"/>
+          <w:szCs w:val="25"/>
+        </w:rPr>
+        <w:t xml:space="preserve">8.5. Painel de Senhas</w:t>
       </w:r>
     </w:p>
     <w:p>
@@ -8675,7 +7856,7 @@
                 <w:sz w:val="19"/>
                 <w:szCs w:val="19"/>
               </w:rPr>
-              <w:t xml:space="preserve">Motorista</w:t>
+              <w:t xml:space="preserve">Consulta</w:t>
             </w:r>
           </w:p>
         </w:tc>
@@ -8683,60 +7864,6 @@
           <w:tcPr>
             <w:tcW w:type="dxa" w:w="6620"/>
             <w:shd w:fill="F2F6FC" w:color="auto" w:val="clear"/>
-            <w:tcMar>
-              <w:top w:type="dxa" w:w="40"/>
-              <w:left w:type="dxa" w:w="90"/>
-              <w:bottom w:type="dxa" w:w="40"/>
-              <w:right w:type="dxa" w:w="90"/>
-            </w:tcMar>
-          </w:tcPr>
-          <w:p>
-            <w:pPr>
-              <w:spacing w:after="20" w:before="20" w:line="252"/>
-            </w:pPr>
-            <w:r>
-              <w:rPr>
-                <w:b w:val="false"/>
-                <w:bCs w:val="false"/>
-                <w:color w:val="000000"/>
-                <w:sz w:val="19"/>
-                <w:szCs w:val="19"/>
-              </w:rPr>
-              <w:t xml:space="preserve">Visualização apenas do mapa de viagem.</w:t>
-            </w:r>
-          </w:p>
-        </w:tc>
-      </w:tr>
-      <w:tr>
-        <w:tc>
-          <w:tcPr>
-            <w:tcW w:type="dxa" w:w="2400"/>
-            <w:tcMar>
-              <w:top w:type="dxa" w:w="40"/>
-              <w:left w:type="dxa" w:w="90"/>
-              <w:bottom w:type="dxa" w:w="40"/>
-              <w:right w:type="dxa" w:w="90"/>
-            </w:tcMar>
-          </w:tcPr>
-          <w:p>
-            <w:pPr>
-              <w:spacing w:after="20" w:before="20" w:line="252"/>
-            </w:pPr>
-            <w:r>
-              <w:rPr>
-                <w:b w:val="false"/>
-                <w:bCs w:val="false"/>
-                <w:color w:val="000000"/>
-                <w:sz w:val="19"/>
-                <w:szCs w:val="19"/>
-              </w:rPr>
-              <w:t xml:space="preserve">Consulta</w:t>
-            </w:r>
-          </w:p>
-        </w:tc>
-        <w:tc>
-          <w:tcPr>
-            <w:tcW w:type="dxa" w:w="6620"/>
             <w:tcMar>
               <w:top w:type="dxa" w:w="40"/>
               <w:left w:type="dxa" w:w="90"/>
@@ -9715,7 +8842,7 @@
                 <w:sz w:val="19"/>
                 <w:szCs w:val="19"/>
               </w:rPr>
-              <w:t xml:space="preserve">Projeto Django + PostgreSQL, login/perfis, auditoria e CRUD de Paciente (campos BPA), Veículo, Motorista e Destino.</w:t>
+              <w:t xml:space="preserve">Projeto Django + PostgreSQL, login/perfis, auditoria e CRUD de Paciente (campos BPA) e Destino.</w:t>
             </w:r>
           </w:p>
         </w:tc>
@@ -9797,7 +8924,7 @@
                 <w:sz w:val="19"/>
                 <w:szCs w:val="19"/>
               </w:rPr>
-              <w:t xml:space="preserve">Viagem + Agendamento com controle de lotação; Cartão de Embarque (PDF); Mapa de Viagem; controle de embarque.</w:t>
+              <w:t xml:space="preserve">Agenda + Agendamento por horário; Cartão de Embarque (PDF); Lista do Dia; controle de embarque.</w:t>
             </w:r>
           </w:p>
         </w:tc>
@@ -9960,7 +9087,7 @@
                 <w:sz w:val="19"/>
                 <w:szCs w:val="19"/>
               </w:rPr>
-              <w:t xml:space="preserve">Relatório BPA (PDF/Excel), pesquisa e dashboard.</w:t>
+              <w:t xml:space="preserve">Relatórios (por agendamento, dia, mês, nome...), BPA (PDF/Excel), pesquisa e dashboard.</w:t>
             </w:r>
           </w:p>
         </w:tc>
@@ -10096,7 +9223,7 @@
           <w:sz w:val="21"/>
           <w:szCs w:val="21"/>
         </w:rPr>
-        <w:t xml:space="preserve">ao final da Fase 2 o sistema já é utilizável na operação diária, substituindo as fichas de marcação, o mapa da van e o cartão de embarque.</w:t>
+        <w:t xml:space="preserve">ao final da Fase 2 o sistema já é utilizável na operação diária, substituindo as fichas de marcação, a lista do dia e o cartão de embarque.</w:t>
       </w:r>
     </w:p>
     <w:p>
@@ -10213,7 +9340,7 @@
                 <w:sz w:val="19"/>
                 <w:szCs w:val="19"/>
               </w:rPr>
-              <w:t xml:space="preserve">Tabelas SIGTAP/CID/CBO</w:t>
+              <w:t xml:space="preserve">Capacidade por horário</w:t>
             </w:r>
           </w:p>
         </w:tc>
@@ -10239,7 +9366,7 @@
                 <w:sz w:val="19"/>
                 <w:szCs w:val="19"/>
               </w:rPr>
-              <w:t xml:space="preserve">Iniciar com código/texto livre; carregar tabelas oficiais em fase posterior (autocomplete).</w:t>
+              <w:t xml:space="preserve">Definir quantos pacientes cada horário comporta (parâmetro configurável).</w:t>
             </w:r>
           </w:p>
         </w:tc>
@@ -10268,7 +9395,7 @@
                 <w:sz w:val="19"/>
                 <w:szCs w:val="19"/>
               </w:rPr>
-              <w:t xml:space="preserve">Notificação por WhatsApp</w:t>
+              <w:t xml:space="preserve">Granularidade dos horários</w:t>
             </w:r>
           </w:p>
         </w:tc>
@@ -10295,7 +9422,7 @@
                 <w:sz w:val="19"/>
                 <w:szCs w:val="19"/>
               </w:rPr>
-              <w:t xml:space="preserve">Manter fora do MVP; avaliar com a Administração por conflitar com a regra de não usar nuvem.</w:t>
+              <w:t xml:space="preserve">Confirmar se os horários serão fixos (ex.: 30 em 30 min) ou livres dentro da janela 06:00–16:30.</w:t>
             </w:r>
           </w:p>
         </w:tc>
@@ -10323,7 +9450,7 @@
                 <w:sz w:val="19"/>
                 <w:szCs w:val="19"/>
               </w:rPr>
-              <w:t xml:space="preserve">CadSUS</w:t>
+              <w:t xml:space="preserve">Campo “tipo de veículo”</w:t>
             </w:r>
           </w:p>
         </w:tc>
@@ -10349,7 +9476,7 @@
                 <w:sz w:val="19"/>
                 <w:szCs w:val="19"/>
               </w:rPr>
-              <w:t xml:space="preserve">Manter arquitetura com API pronta; implementar quando o acesso federal for viável.</w:t>
+              <w:t xml:space="preserve">Confirmar as opções da lista (van, ambulância, automóvel, micro-ônibus, ônibus).</w:t>
             </w:r>
           </w:p>
         </w:tc>
@@ -10378,7 +9505,7 @@
                 <w:sz w:val="19"/>
                 <w:szCs w:val="19"/>
               </w:rPr>
-              <w:t xml:space="preserve">Integração AD/LDAP</w:t>
+              <w:t xml:space="preserve">Tabelas SIGTAP/CID/CBO</w:t>
             </w:r>
           </w:p>
         </w:tc>
@@ -10405,7 +9532,7 @@
                 <w:sz w:val="19"/>
                 <w:szCs w:val="19"/>
               </w:rPr>
-              <w:t xml:space="preserve">Login próprio agora; deixar a camada de autenticação plugável para o AD no futuro.</w:t>
+              <w:t xml:space="preserve">Iniciar com código/texto livre; carregar tabelas oficiais em fase posterior (autocomplete).</w:t>
             </w:r>
           </w:p>
         </w:tc>
@@ -10433,6 +9560,171 @@
                 <w:sz w:val="19"/>
                 <w:szCs w:val="19"/>
               </w:rPr>
+              <w:t xml:space="preserve">Notificação por WhatsApp</w:t>
+            </w:r>
+          </w:p>
+        </w:tc>
+        <w:tc>
+          <w:tcPr>
+            <w:tcW w:type="dxa" w:w="6420"/>
+            <w:tcMar>
+              <w:top w:type="dxa" w:w="40"/>
+              <w:left w:type="dxa" w:w="90"/>
+              <w:bottom w:type="dxa" w:w="40"/>
+              <w:right w:type="dxa" w:w="90"/>
+            </w:tcMar>
+          </w:tcPr>
+          <w:p>
+            <w:pPr>
+              <w:spacing w:after="20" w:before="20" w:line="252"/>
+            </w:pPr>
+            <w:r>
+              <w:rPr>
+                <w:b w:val="false"/>
+                <w:bCs w:val="false"/>
+                <w:color w:val="000000"/>
+                <w:sz w:val="19"/>
+                <w:szCs w:val="19"/>
+              </w:rPr>
+              <w:t xml:space="preserve">Manter fora do MVP; avaliar com a Administração por conflitar com a regra de não usar nuvem.</w:t>
+            </w:r>
+          </w:p>
+        </w:tc>
+      </w:tr>
+      <w:tr>
+        <w:tc>
+          <w:tcPr>
+            <w:tcW w:type="dxa" w:w="2600"/>
+            <w:shd w:fill="F2F6FC" w:color="auto" w:val="clear"/>
+            <w:tcMar>
+              <w:top w:type="dxa" w:w="40"/>
+              <w:left w:type="dxa" w:w="90"/>
+              <w:bottom w:type="dxa" w:w="40"/>
+              <w:right w:type="dxa" w:w="90"/>
+            </w:tcMar>
+          </w:tcPr>
+          <w:p>
+            <w:pPr>
+              <w:spacing w:after="20" w:before="20" w:line="252"/>
+            </w:pPr>
+            <w:r>
+              <w:rPr>
+                <w:b w:val="false"/>
+                <w:bCs w:val="false"/>
+                <w:color w:val="000000"/>
+                <w:sz w:val="19"/>
+                <w:szCs w:val="19"/>
+              </w:rPr>
+              <w:t xml:space="preserve">CadSUS</w:t>
+            </w:r>
+          </w:p>
+        </w:tc>
+        <w:tc>
+          <w:tcPr>
+            <w:tcW w:type="dxa" w:w="6420"/>
+            <w:shd w:fill="F2F6FC" w:color="auto" w:val="clear"/>
+            <w:tcMar>
+              <w:top w:type="dxa" w:w="40"/>
+              <w:left w:type="dxa" w:w="90"/>
+              <w:bottom w:type="dxa" w:w="40"/>
+              <w:right w:type="dxa" w:w="90"/>
+            </w:tcMar>
+          </w:tcPr>
+          <w:p>
+            <w:pPr>
+              <w:spacing w:after="20" w:before="20" w:line="252"/>
+            </w:pPr>
+            <w:r>
+              <w:rPr>
+                <w:b w:val="false"/>
+                <w:bCs w:val="false"/>
+                <w:color w:val="000000"/>
+                <w:sz w:val="19"/>
+                <w:szCs w:val="19"/>
+              </w:rPr>
+              <w:t xml:space="preserve">Manter arquitetura com API pronta; implementar quando o acesso federal for viável.</w:t>
+            </w:r>
+          </w:p>
+        </w:tc>
+      </w:tr>
+      <w:tr>
+        <w:tc>
+          <w:tcPr>
+            <w:tcW w:type="dxa" w:w="2600"/>
+            <w:tcMar>
+              <w:top w:type="dxa" w:w="40"/>
+              <w:left w:type="dxa" w:w="90"/>
+              <w:bottom w:type="dxa" w:w="40"/>
+              <w:right w:type="dxa" w:w="90"/>
+            </w:tcMar>
+          </w:tcPr>
+          <w:p>
+            <w:pPr>
+              <w:spacing w:after="20" w:before="20" w:line="252"/>
+            </w:pPr>
+            <w:r>
+              <w:rPr>
+                <w:b w:val="false"/>
+                <w:bCs w:val="false"/>
+                <w:color w:val="000000"/>
+                <w:sz w:val="19"/>
+                <w:szCs w:val="19"/>
+              </w:rPr>
+              <w:t xml:space="preserve">Integração AD/LDAP</w:t>
+            </w:r>
+          </w:p>
+        </w:tc>
+        <w:tc>
+          <w:tcPr>
+            <w:tcW w:type="dxa" w:w="6420"/>
+            <w:tcMar>
+              <w:top w:type="dxa" w:w="40"/>
+              <w:left w:type="dxa" w:w="90"/>
+              <w:bottom w:type="dxa" w:w="40"/>
+              <w:right w:type="dxa" w:w="90"/>
+            </w:tcMar>
+          </w:tcPr>
+          <w:p>
+            <w:pPr>
+              <w:spacing w:after="20" w:before="20" w:line="252"/>
+            </w:pPr>
+            <w:r>
+              <w:rPr>
+                <w:b w:val="false"/>
+                <w:bCs w:val="false"/>
+                <w:color w:val="000000"/>
+                <w:sz w:val="19"/>
+                <w:szCs w:val="19"/>
+              </w:rPr>
+              <w:t xml:space="preserve">Login próprio agora; deixar a camada de autenticação plugável para o AD no futuro.</w:t>
+            </w:r>
+          </w:p>
+        </w:tc>
+      </w:tr>
+      <w:tr>
+        <w:tc>
+          <w:tcPr>
+            <w:tcW w:type="dxa" w:w="2600"/>
+            <w:shd w:fill="F2F6FC" w:color="auto" w:val="clear"/>
+            <w:tcMar>
+              <w:top w:type="dxa" w:w="40"/>
+              <w:left w:type="dxa" w:w="90"/>
+              <w:bottom w:type="dxa" w:w="40"/>
+              <w:right w:type="dxa" w:w="90"/>
+            </w:tcMar>
+          </w:tcPr>
+          <w:p>
+            <w:pPr>
+              <w:spacing w:after="20" w:before="20" w:line="252"/>
+            </w:pPr>
+            <w:r>
+              <w:rPr>
+                <w:b w:val="false"/>
+                <w:bCs w:val="false"/>
+                <w:color w:val="000000"/>
+                <w:sz w:val="19"/>
+                <w:szCs w:val="19"/>
+              </w:rPr>
               <w:t xml:space="preserve">Modelos oficiais</w:t>
             </w:r>
           </w:p>
@@ -10440,6 +9732,7 @@
         <w:tc>
           <w:tcPr>
             <w:tcW w:type="dxa" w:w="6420"/>
+            <w:shd w:fill="F2F6FC" w:color="auto" w:val="clear"/>
             <w:tcMar>
               <w:top w:type="dxa" w:w="40"/>
               <w:left w:type="dxa" w:w="90"/>
@@ -10490,7 +9783,7 @@
           <w:sz w:val="21"/>
           <w:szCs w:val="21"/>
         </w:rPr>
-        <w:t xml:space="preserve">A análise dos formulários reais mostrou que o valor central do sistema está na agenda de marcações integrada ao mapa de viagem, ao cartão de embarque e ao relatório para o BPA. Concentrar as duas primeiras fases nesse núcleo entrega benefício rápido e concreto à operação, enquanto a arquitetura escolhida (Django + PostgreSQL, em servidor local) mantém o sistema simples de manter e sob total domínio da Prefeitura, em conformidade com a LGPD.</w:t>
+        <w:t xml:space="preserve">A análise dos formulários reais mostrou que o valor central do sistema está na agenda de marcações por horário, integrada à lista do dia, ao cartão de embarque e ao relatório para o BPA. Concentrar as duas primeiras fases nesse núcleo entrega benefício rápido e concreto à operação, enquanto a arquitetura escolhida (Django + PostgreSQL, em servidor local) mantém o sistema simples de manter e sob total domínio da Prefeitura, em conformidade com a LGPD.</w:t>
       </w:r>
     </w:p>
     <w:p>

</xml_diff>